<commit_message>
reports: continue work with list of entities
</commit_message>
<xml_diff>
--- a/reports/1_report.docx
+++ b/reports/1_report.docx
@@ -10,7 +10,6 @@
         <w:rPr>
           <w:b/>
           <w:sz w:val="28"/>
-          <w:lang w:val="en-US"/>
         </w:rPr>
       </w:pPr>
       <w:r>
@@ -29,7 +28,6 @@
         <w:rPr>
           <w:b/>
           <w:sz w:val="28"/>
-          <w:lang w:val="en-US"/>
         </w:rPr>
       </w:pPr>
     </w:p>
@@ -41,7 +39,6 @@
         <w:rPr>
           <w:b/>
           <w:sz w:val="28"/>
-          <w:lang w:val="en-US"/>
         </w:rPr>
       </w:pPr>
     </w:p>
@@ -53,7 +50,6 @@
         <w:rPr>
           <w:b/>
           <w:sz w:val="28"/>
-          <w:lang w:val="en-US"/>
         </w:rPr>
       </w:pPr>
       <w:r>
@@ -433,19 +429,13 @@
         <w:rPr>
           <w:b/>
         </w:rPr>
-        <w:t xml:space="preserve">Список выделенных </w:t>
-      </w:r>
-      <w:r>
-        <w:rPr>
-          <w:b/>
-        </w:rPr>
-        <w:t xml:space="preserve">сущностей: </w:t>
+        <w:t xml:space="preserve">Список выделенных сущностей: </w:t>
       </w:r>
     </w:p>
     <w:tbl>
       <w:tblPr>
         <w:tblStyle w:val="TableGrid"/>
-        <w:tblW w:w="11058" w:type="dxa"/>
+        <w:tblW w:w="11060" w:type="dxa"/>
         <w:tblInd w:w="3" w:type="dxa"/>
         <w:tblCellMar>
           <w:top w:w="119" w:type="dxa"/>
@@ -458,7 +448,7 @@
         <w:gridCol w:w="860"/>
         <w:gridCol w:w="1760"/>
         <w:gridCol w:w="3980"/>
-        <w:gridCol w:w="4458"/>
+        <w:gridCol w:w="4460"/>
       </w:tblGrid>
       <w:tr>
         <w:trPr>
@@ -686,19 +676,7 @@
               <w:rPr>
                 <w:sz w:val="22"/>
               </w:rPr>
-              <w:t xml:space="preserve">Содержит артикул, наименование, </w:t>
-            </w:r>
-            <w:r>
-              <w:rPr>
-                <w:sz w:val="22"/>
-              </w:rPr>
-              <w:t>&amp;</w:t>
-            </w:r>
-            <w:r>
-              <w:rPr>
-                <w:sz w:val="22"/>
-              </w:rPr>
-              <w:t>категория</w:t>
+              <w:t>Содержит артикул, наименование, категория</w:t>
             </w:r>
             <w:r>
               <w:rPr>
@@ -1203,14 +1181,10 @@
               <w:spacing w:after="0" w:line="259" w:lineRule="auto"/>
               <w:ind w:right="53" w:firstLine="0"/>
               <w:jc w:val="center"/>
-              <w:rPr>
-                <w:highlight w:val="lightGray"/>
-              </w:rPr>
-            </w:pPr>
-            <w:r>
-              <w:rPr>
-                <w:sz w:val="22"/>
-                <w:highlight w:val="lightGray"/>
+            </w:pPr>
+            <w:r>
+              <w:rPr>
+                <w:sz w:val="22"/>
               </w:rPr>
               <w:t xml:space="preserve">E5 </w:t>
             </w:r>
@@ -1231,14 +1205,10 @@
               <w:spacing w:after="0" w:line="259" w:lineRule="auto"/>
               <w:ind w:right="0" w:firstLine="0"/>
               <w:jc w:val="left"/>
-              <w:rPr>
-                <w:highlight w:val="lightGray"/>
-              </w:rPr>
-            </w:pPr>
-            <w:r>
-              <w:rPr>
-                <w:sz w:val="22"/>
-                <w:highlight w:val="lightGray"/>
+            </w:pPr>
+            <w:r>
+              <w:rPr>
+                <w:sz w:val="22"/>
               </w:rPr>
               <w:t xml:space="preserve">Правило совместимости </w:t>
             </w:r>
@@ -1258,14 +1228,10 @@
             <w:pPr>
               <w:spacing w:after="0" w:line="259" w:lineRule="auto"/>
               <w:ind w:left="10" w:right="0" w:firstLine="0"/>
-              <w:rPr>
-                <w:highlight w:val="lightGray"/>
-              </w:rPr>
-            </w:pPr>
-            <w:r>
-              <w:rPr>
-                <w:sz w:val="22"/>
-                <w:highlight w:val="lightGray"/>
+            </w:pPr>
+            <w:r>
+              <w:rPr>
+                <w:sz w:val="22"/>
               </w:rPr>
               <w:t xml:space="preserve">Правило, определяющее условия выполнения процесса «совместимости» </w:t>
             </w:r>
@@ -1292,21 +1258,16 @@
               <w:spacing w:after="0" w:line="259" w:lineRule="auto"/>
               <w:ind w:right="0" w:firstLine="0"/>
               <w:jc w:val="left"/>
-              <w:rPr>
-                <w:highlight w:val="lightGray"/>
-              </w:rPr>
-            </w:pPr>
-            <w:r>
-              <w:rPr>
-                <w:sz w:val="22"/>
-                <w:highlight w:val="lightGray"/>
+            </w:pPr>
+            <w:r>
+              <w:rPr>
+                <w:sz w:val="22"/>
               </w:rPr>
               <w:t xml:space="preserve">Содержит </w:t>
             </w:r>
             <w:r>
               <w:rPr>
                 <w:sz w:val="22"/>
-                <w:highlight w:val="lightGray"/>
               </w:rPr>
               <w:tab/>
               <w:t xml:space="preserve">название </w:t>
@@ -1314,7 +1275,6 @@
             <w:r>
               <w:rPr>
                 <w:sz w:val="22"/>
-                <w:highlight w:val="lightGray"/>
               </w:rPr>
               <w:tab/>
               <w:t xml:space="preserve">или </w:t>
@@ -1322,7 +1282,6 @@
             <w:r>
               <w:rPr>
                 <w:sz w:val="22"/>
-                <w:highlight w:val="lightGray"/>
               </w:rPr>
               <w:tab/>
               <w:t xml:space="preserve">код, </w:t>
@@ -1330,26 +1289,35 @@
             <w:r>
               <w:rPr>
                 <w:sz w:val="22"/>
-                <w:highlight w:val="lightGray"/>
               </w:rPr>
               <w:tab/>
-              <w:t xml:space="preserve">условия </w:t>
-            </w:r>
-          </w:p>
-          <w:p>
-            <w:pPr>
-              <w:spacing w:after="0" w:line="259" w:lineRule="auto"/>
-              <w:ind w:left="5" w:right="0" w:firstLine="0"/>
-              <w:rPr>
-                <w:highlight w:val="lightGray"/>
-              </w:rPr>
-            </w:pPr>
-            <w:r>
-              <w:rPr>
-                <w:sz w:val="22"/>
-                <w:highlight w:val="lightGray"/>
-              </w:rPr>
-              <w:t xml:space="preserve">применения, значение/параметры, даты действия, статус </w:t>
+            </w:r>
+            <w:r>
+              <w:rPr>
+                <w:color w:val="806000" w:themeColor="accent4" w:themeShade="80"/>
+                <w:sz w:val="22"/>
+              </w:rPr>
+              <w:t>аргумент 1, компаратор, аргумент 2, дата создания, дата отказа</w:t>
+            </w:r>
+            <w:r>
+              <w:rPr>
+                <w:color w:val="000000" w:themeColor="text1"/>
+                <w:sz w:val="22"/>
+              </w:rPr>
+              <w:t>,</w:t>
+            </w:r>
+            <w:r>
+              <w:rPr>
+                <w:color w:val="000000" w:themeColor="text1"/>
+                <w:sz w:val="22"/>
+              </w:rPr>
+              <w:t xml:space="preserve"> </w:t>
+            </w:r>
+            <w:r>
+              <w:rPr>
+                <w:sz w:val="22"/>
+              </w:rPr>
+              <w:t xml:space="preserve">статус </w:t>
             </w:r>
           </w:p>
         </w:tc>
@@ -1373,14 +1341,10 @@
               <w:spacing w:after="0" w:line="259" w:lineRule="auto"/>
               <w:ind w:right="53" w:firstLine="0"/>
               <w:jc w:val="center"/>
-              <w:rPr>
-                <w:highlight w:val="lightGray"/>
-              </w:rPr>
-            </w:pPr>
-            <w:r>
-              <w:rPr>
-                <w:sz w:val="22"/>
-                <w:highlight w:val="lightGray"/>
+            </w:pPr>
+            <w:r>
+              <w:rPr>
+                <w:sz w:val="22"/>
               </w:rPr>
               <w:t xml:space="preserve">E6 </w:t>
             </w:r>
@@ -1401,14 +1365,10 @@
               <w:spacing w:after="0" w:line="259" w:lineRule="auto"/>
               <w:ind w:right="0" w:firstLine="0"/>
               <w:jc w:val="left"/>
-              <w:rPr>
-                <w:highlight w:val="lightGray"/>
-              </w:rPr>
-            </w:pPr>
-            <w:r>
-              <w:rPr>
-                <w:sz w:val="22"/>
-                <w:highlight w:val="lightGray"/>
+            </w:pPr>
+            <w:r>
+              <w:rPr>
+                <w:sz w:val="22"/>
               </w:rPr>
               <w:t xml:space="preserve">Поставщик </w:t>
             </w:r>
@@ -1428,16 +1388,36 @@
             <w:pPr>
               <w:spacing w:after="0" w:line="259" w:lineRule="auto"/>
               <w:ind w:left="10" w:right="57" w:firstLine="0"/>
-              <w:rPr>
-                <w:highlight w:val="lightGray"/>
-              </w:rPr>
-            </w:pPr>
-            <w:r>
-              <w:rPr>
-                <w:sz w:val="22"/>
-                <w:highlight w:val="lightGray"/>
-              </w:rPr>
-              <w:t xml:space="preserve">Организация или предприниматель, осуществляющий поставку товаров, сырья или материалов </w:t>
+            </w:pPr>
+            <w:r>
+              <w:rPr>
+                <w:sz w:val="22"/>
+              </w:rPr>
+              <w:t>Организация или предприниматель, осуществляющий</w:t>
+            </w:r>
+            <w:r>
+              <w:rPr>
+                <w:sz w:val="22"/>
+              </w:rPr>
+              <w:t xml:space="preserve"> </w:t>
+            </w:r>
+            <w:r>
+              <w:rPr>
+                <w:sz w:val="22"/>
+              </w:rPr>
+              <w:t xml:space="preserve">поставку </w:t>
+            </w:r>
+            <w:r>
+              <w:rPr>
+                <w:sz w:val="22"/>
+              </w:rPr>
+              <w:t>компьютерных компонентов</w:t>
+            </w:r>
+            <w:r>
+              <w:rPr>
+                <w:sz w:val="22"/>
+              </w:rPr>
+              <w:t xml:space="preserve"> </w:t>
             </w:r>
           </w:p>
         </w:tc>
@@ -1460,21 +1440,16 @@
               <w:spacing w:after="0" w:line="259" w:lineRule="auto"/>
               <w:ind w:right="0" w:firstLine="0"/>
               <w:jc w:val="left"/>
-              <w:rPr>
-                <w:highlight w:val="lightGray"/>
-              </w:rPr>
-            </w:pPr>
-            <w:r>
-              <w:rPr>
-                <w:sz w:val="22"/>
-                <w:highlight w:val="lightGray"/>
+            </w:pPr>
+            <w:r>
+              <w:rPr>
+                <w:sz w:val="22"/>
               </w:rPr>
               <w:t xml:space="preserve">Содержит </w:t>
             </w:r>
             <w:r>
               <w:rPr>
                 <w:sz w:val="22"/>
-                <w:highlight w:val="lightGray"/>
               </w:rPr>
               <w:tab/>
               <w:t xml:space="preserve">наименование, </w:t>
@@ -1482,7 +1457,6 @@
             <w:r>
               <w:rPr>
                 <w:sz w:val="22"/>
-                <w:highlight w:val="lightGray"/>
               </w:rPr>
               <w:tab/>
               <w:t xml:space="preserve">реквизиты, </w:t>
@@ -1493,14 +1467,10 @@
               <w:spacing w:after="0" w:line="259" w:lineRule="auto"/>
               <w:ind w:left="5" w:right="0" w:firstLine="0"/>
               <w:jc w:val="left"/>
-              <w:rPr>
-                <w:highlight w:val="lightGray"/>
-              </w:rPr>
-            </w:pPr>
-            <w:r>
-              <w:rPr>
-                <w:sz w:val="22"/>
-                <w:highlight w:val="lightGray"/>
+            </w:pPr>
+            <w:r>
+              <w:rPr>
+                <w:sz w:val="22"/>
               </w:rPr>
               <w:t xml:space="preserve">контактные данные, статус сотрудничества </w:t>
             </w:r>
@@ -1526,14 +1496,10 @@
               <w:spacing w:after="0" w:line="259" w:lineRule="auto"/>
               <w:ind w:right="53" w:firstLine="0"/>
               <w:jc w:val="center"/>
-              <w:rPr>
-                <w:highlight w:val="lightGray"/>
-              </w:rPr>
-            </w:pPr>
-            <w:r>
-              <w:rPr>
-                <w:sz w:val="22"/>
-                <w:highlight w:val="lightGray"/>
+            </w:pPr>
+            <w:r>
+              <w:rPr>
+                <w:sz w:val="22"/>
               </w:rPr>
               <w:lastRenderedPageBreak/>
               <w:t xml:space="preserve">E7 </w:t>
@@ -1555,14 +1521,10 @@
               <w:spacing w:after="0" w:line="259" w:lineRule="auto"/>
               <w:ind w:right="0" w:firstLine="0"/>
               <w:jc w:val="left"/>
-              <w:rPr>
-                <w:highlight w:val="lightGray"/>
-              </w:rPr>
-            </w:pPr>
-            <w:r>
-              <w:rPr>
-                <w:sz w:val="22"/>
-                <w:highlight w:val="lightGray"/>
+            </w:pPr>
+            <w:r>
+              <w:rPr>
+                <w:sz w:val="22"/>
               </w:rPr>
               <w:t xml:space="preserve">Поставка </w:t>
             </w:r>
@@ -1582,16 +1544,30 @@
             <w:pPr>
               <w:spacing w:after="0" w:line="259" w:lineRule="auto"/>
               <w:ind w:left="10" w:right="56" w:firstLine="0"/>
-              <w:rPr>
-                <w:highlight w:val="lightGray"/>
-              </w:rPr>
-            </w:pPr>
-            <w:r>
-              <w:rPr>
-                <w:sz w:val="22"/>
-                <w:highlight w:val="lightGray"/>
-              </w:rPr>
-              <w:t xml:space="preserve">Документ, фиксирующий поступление товаров, сырья или продукции от поставщика </w:t>
+            </w:pPr>
+            <w:r>
+              <w:rPr>
+                <w:sz w:val="22"/>
+              </w:rPr>
+              <w:t xml:space="preserve">Документ, фиксирующий поступление </w:t>
+            </w:r>
+            <w:r>
+              <w:rPr>
+                <w:sz w:val="22"/>
+              </w:rPr>
+              <w:t>комплектую</w:t>
+            </w:r>
+            <w:r>
+              <w:rPr>
+                <w:sz w:val="22"/>
+              </w:rPr>
+              <w:t>щих</w:t>
+            </w:r>
+            <w:r>
+              <w:rPr>
+                <w:sz w:val="22"/>
+              </w:rPr>
+              <w:t xml:space="preserve"> от поставщика </w:t>
             </w:r>
           </w:p>
         </w:tc>
@@ -1608,94 +1584,37 @@
           <w:p>
             <w:pPr>
               <w:spacing w:after="0"/>
-              <w:ind w:left="5" w:right="0" w:firstLine="0"/>
-              <w:rPr>
-                <w:highlight w:val="lightGray"/>
-              </w:rPr>
-            </w:pPr>
-            <w:r>
-              <w:rPr>
-                <w:sz w:val="22"/>
-                <w:highlight w:val="lightGray"/>
-              </w:rPr>
-              <w:t xml:space="preserve">Содержит номер, дата поступления, поставщик, перечень позиций и количество, </w:t>
-            </w:r>
-          </w:p>
-          <w:p>
-            <w:pPr>
-              <w:spacing w:after="0" w:line="259" w:lineRule="auto"/>
-              <w:ind w:left="5" w:right="0" w:firstLine="0"/>
+              <w:ind w:left="5" w:right="0"/>
+            </w:pPr>
+            <w:r>
+              <w:rPr>
+                <w:sz w:val="22"/>
+              </w:rPr>
+              <w:t xml:space="preserve">Содержит номер, дату поступления, поставщика, перечень позиций и количество, </w:t>
+            </w:r>
+          </w:p>
+          <w:p>
+            <w:pPr>
+              <w:spacing w:after="0" w:line="259" w:lineRule="auto"/>
+              <w:ind w:left="5" w:right="0"/>
               <w:jc w:val="left"/>
-              <w:rPr>
-                <w:highlight w:val="lightGray"/>
-              </w:rPr>
-            </w:pPr>
-            <w:r>
-              <w:rPr>
-                <w:sz w:val="22"/>
-                <w:highlight w:val="lightGray"/>
-              </w:rPr>
-              <w:t xml:space="preserve">ответственный, статус </w:t>
+            </w:pPr>
+            <w:r>
+              <w:rPr>
+                <w:sz w:val="22"/>
+              </w:rPr>
+              <w:t xml:space="preserve">ответственного, статус </w:t>
             </w:r>
           </w:p>
         </w:tc>
       </w:tr>
-    </w:tbl>
-    <w:p>
-      <w:pPr>
-        <w:spacing w:after="0" w:line="259" w:lineRule="auto"/>
-        <w:ind w:right="0" w:firstLine="0"/>
-        <w:jc w:val="left"/>
-        <w:rPr>
-          <w:highlight w:val="lightGray"/>
-        </w:rPr>
-      </w:pPr>
-      <w:r>
-        <w:rPr>
-          <w:rFonts w:ascii="Arial" w:eastAsia="Arial" w:hAnsi="Arial" w:cs="Arial"/>
-          <w:sz w:val="22"/>
-          <w:highlight w:val="lightGray"/>
-        </w:rPr>
-        <w:t xml:space="preserve"> </w:t>
-      </w:r>
-    </w:p>
-    <w:p>
-      <w:pPr>
-        <w:spacing w:after="44" w:line="259" w:lineRule="auto"/>
-        <w:ind w:right="0" w:firstLine="0"/>
-        <w:jc w:val="left"/>
-        <w:rPr>
-          <w:highlight w:val="lightGray"/>
-        </w:rPr>
-      </w:pPr>
-      <w:r>
-        <w:rPr>
-          <w:rFonts w:ascii="Arial" w:eastAsia="Arial" w:hAnsi="Arial" w:cs="Arial"/>
-          <w:sz w:val="22"/>
-          <w:highlight w:val="lightGray"/>
-        </w:rPr>
-        <w:t xml:space="preserve"> </w:t>
-      </w:r>
-    </w:p>
-    <w:tbl>
-      <w:tblPr>
-        <w:tblStyle w:val="TableGrid"/>
-        <w:tblW w:w="11060" w:type="dxa"/>
-        <w:tblInd w:w="3" w:type="dxa"/>
-        <w:tblCellMar>
-          <w:top w:w="120" w:type="dxa"/>
-          <w:left w:w="52" w:type="dxa"/>
-          <w:right w:w="8" w:type="dxa"/>
-        </w:tblCellMar>
-        <w:tblLook w:val="04A0" w:firstRow="1" w:lastRow="0" w:firstColumn="1" w:lastColumn="0" w:noHBand="0" w:noVBand="1"/>
-      </w:tblPr>
-      <w:tblGrid>
-        <w:gridCol w:w="860"/>
-        <w:gridCol w:w="1760"/>
-        <w:gridCol w:w="3980"/>
-        <w:gridCol w:w="4460"/>
-      </w:tblGrid>
       <w:tr>
+        <w:tblPrEx>
+          <w:tblCellMar>
+            <w:top w:w="120" w:type="dxa"/>
+            <w:right w:w="8" w:type="dxa"/>
+          </w:tblCellMar>
+        </w:tblPrEx>
         <w:trPr>
           <w:trHeight w:val="1140"/>
         </w:trPr>
@@ -1714,14 +1633,10 @@
               <w:spacing w:after="0" w:line="259" w:lineRule="auto"/>
               <w:ind w:right="55" w:firstLine="0"/>
               <w:jc w:val="center"/>
-              <w:rPr>
-                <w:highlight w:val="lightGray"/>
-              </w:rPr>
-            </w:pPr>
-            <w:r>
-              <w:rPr>
-                <w:sz w:val="22"/>
-                <w:highlight w:val="lightGray"/>
+            </w:pPr>
+            <w:r>
+              <w:rPr>
+                <w:sz w:val="22"/>
               </w:rPr>
               <w:t xml:space="preserve">E8 </w:t>
             </w:r>
@@ -1742,14 +1657,10 @@
               <w:spacing w:after="0" w:line="259" w:lineRule="auto"/>
               <w:ind w:right="0" w:firstLine="0"/>
               <w:jc w:val="left"/>
-              <w:rPr>
-                <w:highlight w:val="lightGray"/>
-              </w:rPr>
-            </w:pPr>
-            <w:r>
-              <w:rPr>
-                <w:sz w:val="22"/>
-                <w:highlight w:val="lightGray"/>
+            </w:pPr>
+            <w:r>
+              <w:rPr>
+                <w:sz w:val="22"/>
               </w:rPr>
               <w:t xml:space="preserve">Партия товара </w:t>
             </w:r>
@@ -1769,16 +1680,24 @@
             <w:pPr>
               <w:spacing w:after="5" w:line="259" w:lineRule="auto"/>
               <w:ind w:left="10" w:right="0" w:firstLine="0"/>
-              <w:rPr>
-                <w:highlight w:val="lightGray"/>
-              </w:rPr>
-            </w:pPr>
-            <w:r>
-              <w:rPr>
-                <w:sz w:val="22"/>
-                <w:highlight w:val="lightGray"/>
-              </w:rPr>
-              <w:t xml:space="preserve">Отдельная партия объекта «товара», </w:t>
+            </w:pPr>
+            <w:r>
+              <w:rPr>
+                <w:sz w:val="22"/>
+              </w:rPr>
+              <w:t>Отдельная партия объекта «</w:t>
+            </w:r>
+            <w:r>
+              <w:rPr>
+                <w:sz w:val="22"/>
+              </w:rPr>
+              <w:t>комплектующая</w:t>
+            </w:r>
+            <w:r>
+              <w:rPr>
+                <w:sz w:val="22"/>
+              </w:rPr>
+              <w:t xml:space="preserve">», </w:t>
             </w:r>
           </w:p>
           <w:p>
@@ -1786,32 +1705,24 @@
               <w:spacing w:after="0" w:line="259" w:lineRule="auto"/>
               <w:ind w:left="10" w:right="0" w:firstLine="0"/>
               <w:jc w:val="left"/>
-              <w:rPr>
-                <w:highlight w:val="lightGray"/>
-              </w:rPr>
-            </w:pPr>
-            <w:r>
-              <w:rPr>
-                <w:sz w:val="22"/>
-                <w:highlight w:val="lightGray"/>
-              </w:rPr>
-              <w:t xml:space="preserve">поступившая </w:t>
-            </w:r>
-            <w:r>
-              <w:rPr>
-                <w:sz w:val="22"/>
-                <w:highlight w:val="lightGray"/>
-              </w:rPr>
-              <w:tab/>
-              <w:t xml:space="preserve">или </w:t>
-            </w:r>
-            <w:r>
-              <w:rPr>
-                <w:sz w:val="22"/>
-                <w:highlight w:val="lightGray"/>
-              </w:rPr>
-              <w:tab/>
-              <w:t xml:space="preserve">произведенная одновременно </w:t>
+            </w:pPr>
+            <w:r>
+              <w:rPr>
+                <w:sz w:val="22"/>
+              </w:rPr>
+              <w:t>П</w:t>
+            </w:r>
+            <w:r>
+              <w:rPr>
+                <w:sz w:val="22"/>
+              </w:rPr>
+              <w:t>оступившая</w:t>
+            </w:r>
+            <w:r>
+              <w:rPr>
+                <w:sz w:val="22"/>
+              </w:rPr>
+              <w:t xml:space="preserve"> одновременно</w:t>
             </w:r>
           </w:p>
         </w:tc>
@@ -1829,38 +1740,60 @@
             <w:pPr>
               <w:spacing w:after="0"/>
               <w:ind w:left="5" w:right="0" w:firstLine="0"/>
-              <w:rPr>
-                <w:highlight w:val="lightGray"/>
-              </w:rPr>
-            </w:pPr>
-            <w:r>
-              <w:rPr>
-                <w:sz w:val="22"/>
-                <w:highlight w:val="lightGray"/>
-              </w:rPr>
-              <w:t xml:space="preserve">Содержит товара, номер партии, дата производства/поступления, количество, срок </w:t>
-            </w:r>
-          </w:p>
-          <w:p>
-            <w:pPr>
-              <w:spacing w:after="0" w:line="259" w:lineRule="auto"/>
-              <w:ind w:left="5" w:right="0" w:firstLine="0"/>
-              <w:jc w:val="left"/>
-              <w:rPr>
-                <w:highlight w:val="lightGray"/>
-              </w:rPr>
-            </w:pPr>
-            <w:r>
-              <w:rPr>
-                <w:sz w:val="22"/>
-                <w:highlight w:val="lightGray"/>
-              </w:rPr>
-              <w:t xml:space="preserve">годности при наличии, текущий остаток, статус </w:t>
+            </w:pPr>
+            <w:r>
+              <w:rPr>
+                <w:sz w:val="22"/>
+              </w:rPr>
+              <w:t xml:space="preserve">Содержит </w:t>
+            </w:r>
+            <w:r>
+              <w:rPr>
+                <w:sz w:val="22"/>
+              </w:rPr>
+              <w:t>комплектующую</w:t>
+            </w:r>
+            <w:r>
+              <w:rPr>
+                <w:sz w:val="22"/>
+              </w:rPr>
+              <w:t>, номер партии, дат</w:t>
+            </w:r>
+            <w:r>
+              <w:rPr>
+                <w:sz w:val="22"/>
+              </w:rPr>
+              <w:t>у</w:t>
+            </w:r>
+            <w:r>
+              <w:rPr>
+                <w:sz w:val="22"/>
+              </w:rPr>
+              <w:t xml:space="preserve"> поступления, количество, текущий остаток, статус</w:t>
+            </w:r>
+            <w:r>
+              <w:rPr>
+                <w:sz w:val="22"/>
+              </w:rPr>
+              <w:t xml:space="preserve">, </w:t>
+            </w:r>
+            <w:r>
+              <w:rPr>
+                <w:color w:val="385623" w:themeColor="accent6" w:themeShade="80"/>
+                <w:sz w:val="22"/>
+              </w:rPr>
+              <w:t>закупочная цена</w:t>
             </w:r>
           </w:p>
         </w:tc>
       </w:tr>
       <w:tr>
+        <w:tblPrEx>
+          <w:tblCellMar>
+            <w:top w:w="120" w:type="dxa"/>
+            <w:right w:w="8" w:type="dxa"/>
+          </w:tblCellMar>
+        </w:tblPrEx>
         <w:trPr>
           <w:trHeight w:val="900"/>
         </w:trPr>
@@ -1879,14 +1812,10 @@
               <w:spacing w:after="0" w:line="259" w:lineRule="auto"/>
               <w:ind w:right="55" w:firstLine="0"/>
               <w:jc w:val="center"/>
-              <w:rPr>
-                <w:highlight w:val="lightGray"/>
-              </w:rPr>
-            </w:pPr>
-            <w:r>
-              <w:rPr>
-                <w:sz w:val="22"/>
-                <w:highlight w:val="lightGray"/>
+            </w:pPr>
+            <w:r>
+              <w:rPr>
+                <w:sz w:val="22"/>
               </w:rPr>
               <w:t xml:space="preserve">E9 </w:t>
             </w:r>
@@ -1907,14 +1836,10 @@
               <w:spacing w:after="0" w:line="259" w:lineRule="auto"/>
               <w:ind w:right="25" w:firstLine="0"/>
               <w:jc w:val="left"/>
-              <w:rPr>
-                <w:highlight w:val="lightGray"/>
-              </w:rPr>
-            </w:pPr>
-            <w:r>
-              <w:rPr>
-                <w:sz w:val="22"/>
-                <w:highlight w:val="lightGray"/>
+            </w:pPr>
+            <w:r>
+              <w:rPr>
+                <w:sz w:val="22"/>
               </w:rPr>
               <w:t xml:space="preserve">Экземпляр товара </w:t>
             </w:r>
@@ -1934,16 +1859,24 @@
             <w:pPr>
               <w:spacing w:after="0" w:line="259" w:lineRule="auto"/>
               <w:ind w:left="10" w:right="0" w:firstLine="0"/>
-              <w:rPr>
-                <w:highlight w:val="lightGray"/>
-              </w:rPr>
-            </w:pPr>
-            <w:r>
-              <w:rPr>
-                <w:sz w:val="22"/>
-                <w:highlight w:val="lightGray"/>
-              </w:rPr>
-              <w:t xml:space="preserve">Отдельный физический экземпляр товара, учитываемый индивидуально </w:t>
+            </w:pPr>
+            <w:r>
+              <w:rPr>
+                <w:sz w:val="22"/>
+              </w:rPr>
+              <w:t xml:space="preserve">Отдельный физический экземпляр </w:t>
+            </w:r>
+            <w:r>
+              <w:rPr>
+                <w:sz w:val="22"/>
+              </w:rPr>
+              <w:t>комплектующей</w:t>
+            </w:r>
+            <w:r>
+              <w:rPr>
+                <w:sz w:val="22"/>
+              </w:rPr>
+              <w:t xml:space="preserve">, учитываемый индивидуально </w:t>
             </w:r>
           </w:p>
         </w:tc>
@@ -1961,21 +1894,59 @@
             <w:pPr>
               <w:spacing w:after="0" w:line="259" w:lineRule="auto"/>
               <w:ind w:left="5" w:right="60" w:firstLine="0"/>
-              <w:rPr>
-                <w:highlight w:val="lightGray"/>
-              </w:rPr>
-            </w:pPr>
-            <w:r>
-              <w:rPr>
-                <w:sz w:val="22"/>
-                <w:highlight w:val="lightGray"/>
-              </w:rPr>
-              <w:t xml:space="preserve">Содержит серийный номер, товар или модель, дата поступления, текущее местонахождение, статус </w:t>
+            </w:pPr>
+            <w:r>
+              <w:rPr>
+                <w:sz w:val="22"/>
+              </w:rPr>
+              <w:t xml:space="preserve">Содержит серийный номер, </w:t>
+            </w:r>
+            <w:r>
+              <w:rPr>
+                <w:sz w:val="22"/>
+              </w:rPr>
+              <w:t xml:space="preserve">модель </w:t>
+            </w:r>
+            <w:r>
+              <w:rPr>
+                <w:sz w:val="22"/>
+              </w:rPr>
+              <w:t>комплектующ</w:t>
+            </w:r>
+            <w:r>
+              <w:rPr>
+                <w:sz w:val="22"/>
+              </w:rPr>
+              <w:t>ей</w:t>
+            </w:r>
+            <w:r>
+              <w:rPr>
+                <w:sz w:val="22"/>
+              </w:rPr>
+              <w:t>, дат</w:t>
+            </w:r>
+            <w:r>
+              <w:rPr>
+                <w:sz w:val="22"/>
+              </w:rPr>
+              <w:t>у</w:t>
+            </w:r>
+            <w:r>
+              <w:rPr>
+                <w:sz w:val="22"/>
+              </w:rPr>
+              <w:t xml:space="preserve"> поступления, текущее местонахождение, статус </w:t>
             </w:r>
           </w:p>
         </w:tc>
       </w:tr>
       <w:tr>
+        <w:tblPrEx>
+          <w:tblCellMar>
+            <w:top w:w="120" w:type="dxa"/>
+            <w:right w:w="8" w:type="dxa"/>
+          </w:tblCellMar>
+        </w:tblPrEx>
         <w:trPr>
           <w:trHeight w:val="900"/>
         </w:trPr>
@@ -1994,14 +1965,10 @@
               <w:spacing w:after="0" w:line="259" w:lineRule="auto"/>
               <w:ind w:right="55" w:firstLine="0"/>
               <w:jc w:val="center"/>
-              <w:rPr>
-                <w:highlight w:val="lightGray"/>
-              </w:rPr>
-            </w:pPr>
-            <w:r>
-              <w:rPr>
-                <w:sz w:val="22"/>
-                <w:highlight w:val="lightGray"/>
+            </w:pPr>
+            <w:r>
+              <w:rPr>
+                <w:sz w:val="22"/>
               </w:rPr>
               <w:t xml:space="preserve">E10 </w:t>
             </w:r>
@@ -2022,14 +1989,10 @@
               <w:spacing w:after="0" w:line="259" w:lineRule="auto"/>
               <w:ind w:right="0" w:firstLine="0"/>
               <w:jc w:val="left"/>
-              <w:rPr>
-                <w:highlight w:val="lightGray"/>
-              </w:rPr>
-            </w:pPr>
-            <w:r>
-              <w:rPr>
-                <w:sz w:val="22"/>
-                <w:highlight w:val="lightGray"/>
+            </w:pPr>
+            <w:r>
+              <w:rPr>
+                <w:sz w:val="22"/>
               </w:rPr>
               <w:t xml:space="preserve">Заказ клиента </w:t>
             </w:r>
@@ -2049,16 +2012,12 @@
             <w:pPr>
               <w:spacing w:after="0" w:line="259" w:lineRule="auto"/>
               <w:ind w:left="10" w:right="0" w:firstLine="0"/>
-              <w:rPr>
-                <w:highlight w:val="lightGray"/>
-              </w:rPr>
-            </w:pPr>
-            <w:r>
-              <w:rPr>
-                <w:sz w:val="22"/>
-                <w:highlight w:val="lightGray"/>
-              </w:rPr>
-              <w:t xml:space="preserve">Документ, фиксирующий оформленный клиентом или подразделением заказ </w:t>
+            </w:pPr>
+            <w:r>
+              <w:rPr>
+                <w:sz w:val="22"/>
+              </w:rPr>
+              <w:t xml:space="preserve">Документ, фиксирующий оформленный клиентом заказ </w:t>
             </w:r>
           </w:p>
         </w:tc>
@@ -2076,21 +2035,35 @@
             <w:pPr>
               <w:spacing w:after="0" w:line="259" w:lineRule="auto"/>
               <w:ind w:left="5" w:right="67" w:firstLine="0"/>
-              <w:rPr>
-                <w:highlight w:val="lightGray"/>
-              </w:rPr>
-            </w:pPr>
-            <w:r>
-              <w:rPr>
-                <w:sz w:val="22"/>
-                <w:highlight w:val="lightGray"/>
-              </w:rPr>
-              <w:t xml:space="preserve">Содержит номер, дата и время оформления, заказчик, перечень позиций, стоимость, текущий статус, ответственный </w:t>
+            </w:pPr>
+            <w:r>
+              <w:rPr>
+                <w:sz w:val="22"/>
+              </w:rPr>
+              <w:t xml:space="preserve">Содержит номер, дата и время оформления, заказчик, </w:t>
+            </w:r>
+            <w:r>
+              <w:rPr>
+                <w:sz w:val="22"/>
+              </w:rPr>
+              <w:t>конфигурацию сборки</w:t>
+            </w:r>
+            <w:r>
+              <w:rPr>
+                <w:sz w:val="22"/>
+              </w:rPr>
+              <w:t xml:space="preserve">, стоимость, текущий статус, ответственный </w:t>
             </w:r>
           </w:p>
         </w:tc>
       </w:tr>
       <w:tr>
+        <w:tblPrEx>
+          <w:tblCellMar>
+            <w:top w:w="120" w:type="dxa"/>
+            <w:right w:w="8" w:type="dxa"/>
+          </w:tblCellMar>
+        </w:tblPrEx>
         <w:trPr>
           <w:trHeight w:val="880"/>
         </w:trPr>
@@ -2109,14 +2082,10 @@
               <w:spacing w:after="0" w:line="259" w:lineRule="auto"/>
               <w:ind w:right="55" w:firstLine="0"/>
               <w:jc w:val="center"/>
-              <w:rPr>
-                <w:highlight w:val="lightGray"/>
-              </w:rPr>
-            </w:pPr>
-            <w:r>
-              <w:rPr>
-                <w:sz w:val="22"/>
-                <w:highlight w:val="lightGray"/>
+            </w:pPr>
+            <w:r>
+              <w:rPr>
+                <w:sz w:val="22"/>
               </w:rPr>
               <w:t xml:space="preserve">E11 </w:t>
             </w:r>
@@ -2137,14 +2106,10 @@
               <w:spacing w:after="0" w:line="259" w:lineRule="auto"/>
               <w:ind w:right="0" w:firstLine="0"/>
               <w:jc w:val="left"/>
-              <w:rPr>
-                <w:highlight w:val="lightGray"/>
-              </w:rPr>
-            </w:pPr>
-            <w:r>
-              <w:rPr>
-                <w:sz w:val="22"/>
-                <w:highlight w:val="lightGray"/>
+            </w:pPr>
+            <w:r>
+              <w:rPr>
+                <w:sz w:val="22"/>
               </w:rPr>
               <w:t xml:space="preserve">Конфигурация сборки </w:t>
             </w:r>
@@ -2160,51 +2125,25 @@
               <w:right w:val="single" w:sz="8" w:space="0" w:color="000000"/>
             </w:tcBorders>
           </w:tcPr>
-          <w:p>
-            <w:pPr>
-              <w:spacing w:after="0"/>
-              <w:ind w:left="10" w:right="0" w:firstLine="0"/>
-              <w:rPr>
-                <w:highlight w:val="lightGray"/>
-              </w:rPr>
-            </w:pPr>
-            <w:r>
-              <w:rPr>
-                <w:sz w:val="22"/>
-                <w:highlight w:val="lightGray"/>
-              </w:rPr>
-              <w:t>Версионируемая</w:t>
-            </w:r>
-            <w:r>
-              <w:rPr>
-                <w:sz w:val="22"/>
-                <w:highlight w:val="lightGray"/>
-              </w:rPr>
-              <w:t xml:space="preserve"> </w:t>
-            </w:r>
-            <w:r>
-              <w:rPr>
-                <w:sz w:val="22"/>
-                <w:highlight w:val="lightGray"/>
-              </w:rPr>
-              <w:t xml:space="preserve">конфигурация, определяющая параметры </w:t>
-            </w:r>
-          </w:p>
           <w:p>
             <w:pPr>
               <w:spacing w:after="0" w:line="259" w:lineRule="auto"/>
               <w:ind w:left="10" w:right="0" w:firstLine="0"/>
               <w:jc w:val="left"/>
-              <w:rPr>
-                <w:highlight w:val="lightGray"/>
-              </w:rPr>
-            </w:pPr>
-            <w:r>
-              <w:rPr>
-                <w:sz w:val="22"/>
-                <w:highlight w:val="lightGray"/>
-              </w:rPr>
-              <w:t xml:space="preserve">формирования программной сборки </w:t>
+            </w:pPr>
+            <w:r>
+              <w:rPr>
+                <w:color w:val="806000" w:themeColor="accent4" w:themeShade="80"/>
+                <w:sz w:val="22"/>
+              </w:rPr>
+              <w:t>Набор совместимых комплектующих, которые представляют собой некую составляющую сборки</w:t>
+            </w:r>
+            <w:r>
+              <w:rPr>
+                <w:color w:val="806000" w:themeColor="accent4" w:themeShade="80"/>
+                <w:sz w:val="22"/>
+              </w:rPr>
+              <w:t xml:space="preserve"> </w:t>
             </w:r>
           </w:p>
         </w:tc>
@@ -2222,38 +2161,54 @@
             <w:pPr>
               <w:spacing w:after="0"/>
               <w:ind w:left="5" w:right="0" w:firstLine="0"/>
-              <w:rPr>
-                <w:highlight w:val="lightGray"/>
-              </w:rPr>
-            </w:pPr>
-            <w:r>
-              <w:rPr>
-                <w:sz w:val="22"/>
-                <w:highlight w:val="lightGray"/>
-              </w:rPr>
-              <w:t xml:space="preserve">Содержит номер/версия, целевая архитектура, набор компонентов и репозиториев, </w:t>
-            </w:r>
-          </w:p>
-          <w:p>
-            <w:pPr>
-              <w:spacing w:after="0" w:line="259" w:lineRule="auto"/>
-              <w:ind w:left="5" w:right="0" w:firstLine="0"/>
-              <w:jc w:val="left"/>
-              <w:rPr>
-                <w:highlight w:val="lightGray"/>
-              </w:rPr>
-            </w:pPr>
-            <w:r>
-              <w:rPr>
-                <w:sz w:val="22"/>
-                <w:highlight w:val="lightGray"/>
-              </w:rPr>
-              <w:t xml:space="preserve">параметры сборки, автор, статус </w:t>
+            </w:pPr>
+            <w:r>
+              <w:rPr>
+                <w:sz w:val="22"/>
+              </w:rPr>
+              <w:t xml:space="preserve">Содержит </w:t>
+            </w:r>
+            <w:r>
+              <w:rPr>
+                <w:sz w:val="22"/>
+              </w:rPr>
+              <w:t>номер сборки</w:t>
+            </w:r>
+            <w:r>
+              <w:rPr>
+                <w:sz w:val="22"/>
+              </w:rPr>
+              <w:t xml:space="preserve">, </w:t>
+            </w:r>
+            <w:r>
+              <w:rPr>
+                <w:color w:val="806000" w:themeColor="accent4" w:themeShade="80"/>
+                <w:sz w:val="22"/>
+              </w:rPr>
+              <w:t>перечень комплектующих</w:t>
+            </w:r>
+            <w:r>
+              <w:rPr>
+                <w:sz w:val="22"/>
+              </w:rPr>
+              <w:t xml:space="preserve"> </w:t>
+            </w:r>
+            <w:r>
+              <w:rPr>
+                <w:sz w:val="22"/>
+              </w:rPr>
+              <w:t xml:space="preserve">, статус </w:t>
             </w:r>
           </w:p>
         </w:tc>
       </w:tr>
       <w:tr>
+        <w:tblPrEx>
+          <w:tblCellMar>
+            <w:top w:w="120" w:type="dxa"/>
+            <w:right w:w="8" w:type="dxa"/>
+          </w:tblCellMar>
+        </w:tblPrEx>
         <w:trPr>
           <w:trHeight w:val="900"/>
         </w:trPr>
@@ -2272,14 +2227,10 @@
               <w:spacing w:after="0" w:line="259" w:lineRule="auto"/>
               <w:ind w:right="55" w:firstLine="0"/>
               <w:jc w:val="center"/>
-              <w:rPr>
-                <w:highlight w:val="lightGray"/>
-              </w:rPr>
-            </w:pPr>
-            <w:r>
-              <w:rPr>
-                <w:sz w:val="22"/>
-                <w:highlight w:val="lightGray"/>
+            </w:pPr>
+            <w:r>
+              <w:rPr>
+                <w:sz w:val="22"/>
               </w:rPr>
               <w:t xml:space="preserve">E12 </w:t>
             </w:r>
@@ -2300,16 +2251,24 @@
               <w:spacing w:after="0" w:line="259" w:lineRule="auto"/>
               <w:ind w:right="0" w:firstLine="0"/>
               <w:jc w:val="left"/>
-              <w:rPr>
-                <w:highlight w:val="lightGray"/>
-              </w:rPr>
-            </w:pPr>
-            <w:r>
-              <w:rPr>
-                <w:sz w:val="22"/>
-                <w:highlight w:val="lightGray"/>
-              </w:rPr>
-              <w:t xml:space="preserve">Компонент конфигурации </w:t>
+            </w:pPr>
+            <w:r>
+              <w:rPr>
+                <w:sz w:val="22"/>
+              </w:rPr>
+              <w:t xml:space="preserve">Компонент </w:t>
+            </w:r>
+            <w:r>
+              <w:rPr>
+                <w:sz w:val="22"/>
+              </w:rPr>
+              <w:t>конфигурации сборки</w:t>
+            </w:r>
+            <w:r>
+              <w:rPr>
+                <w:sz w:val="22"/>
+              </w:rPr>
+              <w:t xml:space="preserve"> </w:t>
             </w:r>
           </w:p>
         </w:tc>
@@ -2327,14 +2286,10 @@
             <w:pPr>
               <w:spacing w:after="0" w:line="259" w:lineRule="auto"/>
               <w:ind w:left="10" w:right="59" w:firstLine="0"/>
-              <w:rPr>
-                <w:highlight w:val="lightGray"/>
-              </w:rPr>
-            </w:pPr>
-            <w:r>
-              <w:rPr>
-                <w:sz w:val="22"/>
-                <w:highlight w:val="lightGray"/>
+            </w:pPr>
+            <w:r>
+              <w:rPr>
+                <w:sz w:val="22"/>
               </w:rPr>
               <w:t xml:space="preserve">Запись, включающая отдельный компонент в состав более сложного объекта </w:t>
             </w:r>
@@ -2354,21 +2309,41 @@
             <w:pPr>
               <w:spacing w:after="0" w:line="259" w:lineRule="auto"/>
               <w:ind w:left="5" w:right="0" w:firstLine="0"/>
-              <w:rPr>
-                <w:highlight w:val="lightGray"/>
-              </w:rPr>
-            </w:pPr>
-            <w:r>
-              <w:rPr>
-                <w:sz w:val="22"/>
-                <w:highlight w:val="lightGray"/>
-              </w:rPr>
-              <w:t xml:space="preserve">Содержит родительский объект, компонент, количество, порядок или роль </w:t>
+            </w:pPr>
+            <w:r>
+              <w:rPr>
+                <w:sz w:val="22"/>
+              </w:rPr>
+              <w:t xml:space="preserve">Содержит родительский объект, </w:t>
+            </w:r>
+            <w:r>
+              <w:rPr>
+                <w:sz w:val="22"/>
+              </w:rPr>
+              <w:t xml:space="preserve">экземпляр </w:t>
+            </w:r>
+            <w:r>
+              <w:rPr>
+                <w:sz w:val="22"/>
+              </w:rPr>
+              <w:t>комплектующей</w:t>
+            </w:r>
+            <w:r>
+              <w:rPr>
+                <w:sz w:val="22"/>
+              </w:rPr>
+              <w:t xml:space="preserve">, количество, роль </w:t>
             </w:r>
           </w:p>
         </w:tc>
       </w:tr>
       <w:tr>
+        <w:tblPrEx>
+          <w:tblCellMar>
+            <w:top w:w="120" w:type="dxa"/>
+            <w:right w:w="8" w:type="dxa"/>
+          </w:tblCellMar>
+        </w:tblPrEx>
         <w:trPr>
           <w:trHeight w:val="900"/>
         </w:trPr>
@@ -2517,6 +2492,12 @@
         </w:tc>
       </w:tr>
       <w:tr>
+        <w:tblPrEx>
+          <w:tblCellMar>
+            <w:top w:w="120" w:type="dxa"/>
+            <w:right w:w="8" w:type="dxa"/>
+          </w:tblCellMar>
+        </w:tblPrEx>
         <w:trPr>
           <w:trHeight w:val="880"/>
         </w:trPr>
@@ -2632,6 +2613,12 @@
         </w:tc>
       </w:tr>
       <w:tr>
+        <w:tblPrEx>
+          <w:tblCellMar>
+            <w:top w:w="120" w:type="dxa"/>
+            <w:right w:w="8" w:type="dxa"/>
+          </w:tblCellMar>
+        </w:tblPrEx>
         <w:trPr>
           <w:trHeight w:val="900"/>
         </w:trPr>
@@ -2747,6 +2734,12 @@
         </w:tc>
       </w:tr>
       <w:tr>
+        <w:tblPrEx>
+          <w:tblCellMar>
+            <w:top w:w="120" w:type="dxa"/>
+            <w:right w:w="8" w:type="dxa"/>
+          </w:tblCellMar>
+        </w:tblPrEx>
         <w:trPr>
           <w:trHeight w:val="900"/>
         </w:trPr>
@@ -2880,6 +2873,12 @@
         </w:tc>
       </w:tr>
       <w:tr>
+        <w:tblPrEx>
+          <w:tblCellMar>
+            <w:top w:w="120" w:type="dxa"/>
+            <w:right w:w="8" w:type="dxa"/>
+          </w:tblCellMar>
+        </w:tblPrEx>
         <w:trPr>
           <w:trHeight w:val="880"/>
         </w:trPr>
@@ -3012,6 +3011,12 @@
         </w:tc>
       </w:tr>
       <w:tr>
+        <w:tblPrEx>
+          <w:tblCellMar>
+            <w:top w:w="120" w:type="dxa"/>
+            <w:right w:w="8" w:type="dxa"/>
+          </w:tblCellMar>
+        </w:tblPrEx>
         <w:trPr>
           <w:trHeight w:val="900"/>
         </w:trPr>

</xml_diff>

<commit_message>
reports: end writing lab 1 report
</commit_message>
<xml_diff>
--- a/reports/1_report.docx
+++ b/reports/1_report.docx
@@ -355,17 +355,30 @@
         <w:jc w:val="left"/>
         <w:rPr>
           <w:b/>
-          <w:color w:val="C00000"/>
           <w:sz w:val="28"/>
         </w:rPr>
       </w:pPr>
       <w:r>
         <w:rPr>
           <w:b/>
-          <w:color w:val="C00000"/>
-          <w:sz w:val="28"/>
-        </w:rPr>
-        <w:t>НАДО РЕАЛИЗОВАТЬ</w:t>
+          <w:sz w:val="28"/>
+          <w:lang w:val="en-US"/>
+        </w:rPr>
+        <w:t>R</w:t>
+      </w:r>
+      <w:r>
+        <w:rPr>
+          <w:b/>
+          <w:sz w:val="28"/>
+        </w:rPr>
+        <w:t>1</w:t>
+      </w:r>
+      <w:r>
+        <w:rPr>
+          <w:b/>
+          <w:sz w:val="28"/>
+        </w:rPr>
+        <w:t xml:space="preserve"> Каждая модель комплектующей должна принадлежать лишь одной категории комплектующей</w:t>
       </w:r>
     </w:p>
     <w:p>
@@ -378,6 +391,653 @@
           <w:sz w:val="28"/>
         </w:rPr>
       </w:pPr>
+      <w:r>
+        <w:rPr>
+          <w:b/>
+          <w:sz w:val="28"/>
+          <w:lang w:val="en-US"/>
+        </w:rPr>
+        <w:t>R</w:t>
+      </w:r>
+      <w:r>
+        <w:rPr>
+          <w:b/>
+          <w:sz w:val="28"/>
+        </w:rPr>
+        <w:t xml:space="preserve">2 </w:t>
+      </w:r>
+      <w:r>
+        <w:rPr>
+          <w:b/>
+          <w:sz w:val="28"/>
+        </w:rPr>
+        <w:t xml:space="preserve">У модели комплектующей должны быть </w:t>
+      </w:r>
+      <w:r>
+        <w:rPr>
+          <w:b/>
+          <w:sz w:val="28"/>
+          <w:lang w:val="en-US"/>
+        </w:rPr>
+        <w:t>NOT</w:t>
+      </w:r>
+      <w:r>
+        <w:rPr>
+          <w:b/>
+          <w:sz w:val="28"/>
+        </w:rPr>
+        <w:t xml:space="preserve"> </w:t>
+      </w:r>
+      <w:r>
+        <w:rPr>
+          <w:b/>
+          <w:sz w:val="28"/>
+          <w:lang w:val="en-US"/>
+        </w:rPr>
+        <w:t>NULL</w:t>
+      </w:r>
+      <w:r>
+        <w:rPr>
+          <w:b/>
+          <w:sz w:val="28"/>
+        </w:rPr>
+        <w:t xml:space="preserve"> </w:t>
+      </w:r>
+      <w:r>
+        <w:rPr>
+          <w:b/>
+          <w:sz w:val="28"/>
+        </w:rPr>
+        <w:t>все характеристики</w:t>
+      </w:r>
+    </w:p>
+    <w:p>
+      <w:pPr>
+        <w:spacing w:after="0" w:line="259" w:lineRule="auto"/>
+        <w:ind w:right="0" w:firstLine="0"/>
+        <w:jc w:val="left"/>
+        <w:rPr>
+          <w:b/>
+          <w:sz w:val="28"/>
+        </w:rPr>
+      </w:pPr>
+      <w:r>
+        <w:rPr>
+          <w:b/>
+          <w:sz w:val="28"/>
+          <w:lang w:val="en-US"/>
+        </w:rPr>
+        <w:t>R</w:t>
+      </w:r>
+      <w:r>
+        <w:rPr>
+          <w:b/>
+          <w:sz w:val="28"/>
+        </w:rPr>
+        <w:t xml:space="preserve">3 </w:t>
+      </w:r>
+      <w:r>
+        <w:rPr>
+          <w:b/>
+          <w:sz w:val="28"/>
+        </w:rPr>
+        <w:t>При добавлении новой комплектующей все её характеристики должны быть приведены к стандартным единицам измерения</w:t>
+      </w:r>
+    </w:p>
+    <w:p>
+      <w:pPr>
+        <w:spacing w:after="0" w:line="259" w:lineRule="auto"/>
+        <w:ind w:right="0" w:firstLine="0"/>
+        <w:jc w:val="left"/>
+        <w:rPr>
+          <w:b/>
+          <w:sz w:val="28"/>
+        </w:rPr>
+      </w:pPr>
+      <w:r>
+        <w:rPr>
+          <w:b/>
+          <w:sz w:val="28"/>
+          <w:lang w:val="en-US"/>
+        </w:rPr>
+        <w:t>R</w:t>
+      </w:r>
+      <w:r>
+        <w:rPr>
+          <w:b/>
+          <w:sz w:val="28"/>
+        </w:rPr>
+        <w:t xml:space="preserve">3.1 </w:t>
+      </w:r>
+      <w:r>
+        <w:rPr>
+          <w:b/>
+          <w:sz w:val="28"/>
+        </w:rPr>
+        <w:t>Должен быть создан документ, регламентирующий стандартные единицы измерения той или иной характеристики</w:t>
+      </w:r>
+    </w:p>
+    <w:p>
+      <w:pPr>
+        <w:spacing w:after="0" w:line="259" w:lineRule="auto"/>
+        <w:ind w:right="0" w:firstLine="0"/>
+        <w:jc w:val="left"/>
+        <w:rPr>
+          <w:b/>
+          <w:sz w:val="28"/>
+        </w:rPr>
+      </w:pPr>
+      <w:r>
+        <w:rPr>
+          <w:b/>
+          <w:sz w:val="28"/>
+          <w:lang w:val="en-US"/>
+        </w:rPr>
+        <w:t>R</w:t>
+      </w:r>
+      <w:r>
+        <w:rPr>
+          <w:b/>
+          <w:sz w:val="28"/>
+        </w:rPr>
+        <w:t xml:space="preserve">4 </w:t>
+      </w:r>
+      <w:r>
+        <w:rPr>
+          <w:b/>
+          <w:sz w:val="28"/>
+        </w:rPr>
+        <w:t>Правило совместимости должно содержать ссылки на валидные аргументы</w:t>
+      </w:r>
+    </w:p>
+    <w:p>
+      <w:pPr>
+        <w:spacing w:after="0" w:line="259" w:lineRule="auto"/>
+        <w:ind w:right="0" w:firstLine="0"/>
+        <w:jc w:val="left"/>
+        <w:rPr>
+          <w:b/>
+          <w:sz w:val="28"/>
+        </w:rPr>
+      </w:pPr>
+      <w:r>
+        <w:rPr>
+          <w:b/>
+          <w:sz w:val="28"/>
+          <w:lang w:val="en-US"/>
+        </w:rPr>
+        <w:t>R</w:t>
+      </w:r>
+      <w:r>
+        <w:rPr>
+          <w:b/>
+          <w:sz w:val="28"/>
+        </w:rPr>
+        <w:t xml:space="preserve">5 </w:t>
+      </w:r>
+      <w:r>
+        <w:rPr>
+          <w:b/>
+          <w:sz w:val="28"/>
+        </w:rPr>
+        <w:t>При изменении правила совместимости, оно «замораживается» и уходит в историю. Для проверки следует проверить дату отказа</w:t>
+      </w:r>
+    </w:p>
+    <w:p>
+      <w:pPr>
+        <w:spacing w:after="0" w:line="259" w:lineRule="auto"/>
+        <w:ind w:right="0" w:firstLine="0"/>
+        <w:jc w:val="left"/>
+        <w:rPr>
+          <w:b/>
+          <w:sz w:val="28"/>
+        </w:rPr>
+      </w:pPr>
+      <w:r>
+        <w:rPr>
+          <w:b/>
+          <w:sz w:val="28"/>
+          <w:lang w:val="en-US"/>
+        </w:rPr>
+        <w:t>R</w:t>
+      </w:r>
+      <w:r>
+        <w:rPr>
+          <w:b/>
+          <w:sz w:val="28"/>
+        </w:rPr>
+        <w:t xml:space="preserve">6 </w:t>
+      </w:r>
+      <w:r>
+        <w:rPr>
+          <w:b/>
+          <w:sz w:val="28"/>
+        </w:rPr>
+        <w:t>При сборке нового компьютера, система обязана проходить по всем правилам совместимости для определения валидности сборки</w:t>
+      </w:r>
+    </w:p>
+    <w:p>
+      <w:pPr>
+        <w:spacing w:after="0" w:line="259" w:lineRule="auto"/>
+        <w:ind w:right="0" w:firstLine="0"/>
+        <w:jc w:val="left"/>
+        <w:rPr>
+          <w:b/>
+          <w:sz w:val="28"/>
+        </w:rPr>
+      </w:pPr>
+      <w:r>
+        <w:rPr>
+          <w:b/>
+          <w:sz w:val="28"/>
+          <w:lang w:val="en-US"/>
+        </w:rPr>
+        <w:t>R</w:t>
+      </w:r>
+      <w:r>
+        <w:rPr>
+          <w:b/>
+          <w:sz w:val="28"/>
+        </w:rPr>
+        <w:t xml:space="preserve">7 </w:t>
+      </w:r>
+      <w:r>
+        <w:rPr>
+          <w:b/>
+          <w:sz w:val="28"/>
+        </w:rPr>
+        <w:t>При нарушении обязательных условий сборку компьютера может одобрить лишь технический специалист</w:t>
+      </w:r>
+    </w:p>
+    <w:p>
+      <w:pPr>
+        <w:spacing w:after="0" w:line="259" w:lineRule="auto"/>
+        <w:ind w:right="0" w:firstLine="0"/>
+        <w:jc w:val="left"/>
+        <w:rPr>
+          <w:b/>
+          <w:sz w:val="28"/>
+        </w:rPr>
+      </w:pPr>
+      <w:r>
+        <w:rPr>
+          <w:b/>
+          <w:sz w:val="28"/>
+          <w:lang w:val="en-US"/>
+        </w:rPr>
+        <w:t>R</w:t>
+      </w:r>
+      <w:r>
+        <w:rPr>
+          <w:b/>
+          <w:sz w:val="28"/>
+        </w:rPr>
+        <w:t xml:space="preserve">8 </w:t>
+      </w:r>
+      <w:r>
+        <w:rPr>
+          <w:b/>
+          <w:sz w:val="28"/>
+        </w:rPr>
+        <w:t>Учет отдельной комплектующей ведется благодаря ее серийному номеру</w:t>
+      </w:r>
+    </w:p>
+    <w:p>
+      <w:pPr>
+        <w:spacing w:after="0" w:line="259" w:lineRule="auto"/>
+        <w:ind w:right="0" w:firstLine="0"/>
+        <w:jc w:val="left"/>
+        <w:rPr>
+          <w:b/>
+          <w:sz w:val="28"/>
+        </w:rPr>
+      </w:pPr>
+      <w:r>
+        <w:rPr>
+          <w:b/>
+          <w:sz w:val="28"/>
+          <w:lang w:val="en-US"/>
+        </w:rPr>
+        <w:t>R</w:t>
+      </w:r>
+      <w:r>
+        <w:rPr>
+          <w:b/>
+          <w:sz w:val="28"/>
+        </w:rPr>
+        <w:t>8.1 Серийный номер комплектующей должен быть уникален</w:t>
+      </w:r>
+    </w:p>
+    <w:p>
+      <w:pPr>
+        <w:spacing w:after="0" w:line="259" w:lineRule="auto"/>
+        <w:ind w:right="0" w:firstLine="0"/>
+        <w:jc w:val="left"/>
+        <w:rPr>
+          <w:b/>
+          <w:sz w:val="28"/>
+        </w:rPr>
+      </w:pPr>
+      <w:r>
+        <w:rPr>
+          <w:b/>
+          <w:sz w:val="28"/>
+          <w:lang w:val="en-US"/>
+        </w:rPr>
+        <w:t>R</w:t>
+      </w:r>
+      <w:r>
+        <w:rPr>
+          <w:b/>
+          <w:sz w:val="28"/>
+        </w:rPr>
+        <w:t xml:space="preserve">9 </w:t>
+      </w:r>
+      <w:r>
+        <w:rPr>
+          <w:b/>
+          <w:sz w:val="28"/>
+        </w:rPr>
+        <w:t>Любой экземпляр комплектующей привязан к той или иной партии</w:t>
+      </w:r>
+    </w:p>
+    <w:p>
+      <w:pPr>
+        <w:spacing w:after="0" w:line="259" w:lineRule="auto"/>
+        <w:ind w:right="0" w:firstLine="0"/>
+        <w:jc w:val="left"/>
+        <w:rPr>
+          <w:b/>
+          <w:sz w:val="28"/>
+        </w:rPr>
+      </w:pPr>
+      <w:r>
+        <w:rPr>
+          <w:b/>
+          <w:sz w:val="28"/>
+          <w:lang w:val="en-US"/>
+        </w:rPr>
+        <w:t>R</w:t>
+      </w:r>
+      <w:r>
+        <w:rPr>
+          <w:b/>
+          <w:sz w:val="28"/>
+        </w:rPr>
+        <w:t xml:space="preserve">10 </w:t>
+      </w:r>
+      <w:r>
+        <w:rPr>
+          <w:b/>
+          <w:sz w:val="28"/>
+        </w:rPr>
+        <w:t>Экземпляр комплектующей / сборка не может находиться одновременно в двух взаимоисключающих состояниях</w:t>
+      </w:r>
+    </w:p>
+    <w:p>
+      <w:pPr>
+        <w:spacing w:after="0" w:line="259" w:lineRule="auto"/>
+        <w:ind w:right="0" w:firstLine="0"/>
+        <w:jc w:val="left"/>
+        <w:rPr>
+          <w:b/>
+          <w:sz w:val="28"/>
+        </w:rPr>
+      </w:pPr>
+      <w:r>
+        <w:rPr>
+          <w:b/>
+          <w:sz w:val="28"/>
+          <w:lang w:val="en-US"/>
+        </w:rPr>
+        <w:t>R</w:t>
+      </w:r>
+      <w:r>
+        <w:rPr>
+          <w:b/>
+          <w:sz w:val="28"/>
+        </w:rPr>
+        <w:t xml:space="preserve">11 </w:t>
+      </w:r>
+      <w:r>
+        <w:rPr>
+          <w:b/>
+          <w:sz w:val="28"/>
+        </w:rPr>
+        <w:t>Перед началом сборки необходимо зарезервировать нужные экземпляры комплектующих</w:t>
+      </w:r>
+    </w:p>
+    <w:p>
+      <w:pPr>
+        <w:spacing w:after="0" w:line="259" w:lineRule="auto"/>
+        <w:ind w:right="0" w:firstLine="0"/>
+        <w:jc w:val="left"/>
+        <w:rPr>
+          <w:b/>
+          <w:sz w:val="28"/>
+        </w:rPr>
+      </w:pPr>
+      <w:r>
+        <w:rPr>
+          <w:b/>
+          <w:sz w:val="28"/>
+          <w:lang w:val="en-US"/>
+        </w:rPr>
+        <w:t>R</w:t>
+      </w:r>
+      <w:r>
+        <w:rPr>
+          <w:b/>
+          <w:sz w:val="28"/>
+        </w:rPr>
+        <w:t xml:space="preserve">12 </w:t>
+      </w:r>
+      <w:r>
+        <w:rPr>
+          <w:b/>
+          <w:sz w:val="28"/>
+        </w:rPr>
+        <w:t>Резерв экземпляра имеет срок действия. По его истечении резерв снимается</w:t>
+      </w:r>
+    </w:p>
+    <w:p>
+      <w:pPr>
+        <w:spacing w:after="0" w:line="259" w:lineRule="auto"/>
+        <w:ind w:right="0" w:firstLine="0"/>
+        <w:jc w:val="left"/>
+        <w:rPr>
+          <w:b/>
+          <w:sz w:val="28"/>
+        </w:rPr>
+      </w:pPr>
+      <w:r>
+        <w:rPr>
+          <w:b/>
+          <w:sz w:val="28"/>
+          <w:lang w:val="en-US"/>
+        </w:rPr>
+        <w:t>R</w:t>
+      </w:r>
+      <w:r>
+        <w:rPr>
+          <w:b/>
+          <w:sz w:val="28"/>
+        </w:rPr>
+        <w:t xml:space="preserve">13 </w:t>
+      </w:r>
+      <w:r>
+        <w:rPr>
+          <w:b/>
+          <w:sz w:val="28"/>
+        </w:rPr>
+        <w:t>Сборка должна знать, какие именно экземпляры компонентов в ней установлены</w:t>
+      </w:r>
+    </w:p>
+    <w:p>
+      <w:pPr>
+        <w:spacing w:after="0" w:line="259" w:lineRule="auto"/>
+        <w:ind w:right="0" w:firstLine="0"/>
+        <w:jc w:val="left"/>
+        <w:rPr>
+          <w:b/>
+          <w:sz w:val="28"/>
+        </w:rPr>
+      </w:pPr>
+      <w:r>
+        <w:rPr>
+          <w:b/>
+          <w:sz w:val="28"/>
+          <w:lang w:val="en-US"/>
+        </w:rPr>
+        <w:t>R</w:t>
+      </w:r>
+      <w:r>
+        <w:rPr>
+          <w:b/>
+          <w:sz w:val="28"/>
+        </w:rPr>
+        <w:t xml:space="preserve">14 </w:t>
+      </w:r>
+      <w:r>
+        <w:rPr>
+          <w:b/>
+          <w:sz w:val="28"/>
+        </w:rPr>
+        <w:t>После сборки компьютера он должен пройти обязательное тестирование</w:t>
+      </w:r>
+    </w:p>
+    <w:p>
+      <w:pPr>
+        <w:spacing w:after="0" w:line="259" w:lineRule="auto"/>
+        <w:ind w:right="0" w:firstLine="0"/>
+        <w:jc w:val="left"/>
+        <w:rPr>
+          <w:b/>
+          <w:sz w:val="28"/>
+        </w:rPr>
+      </w:pPr>
+      <w:r>
+        <w:rPr>
+          <w:b/>
+          <w:sz w:val="28"/>
+          <w:lang w:val="en-US"/>
+        </w:rPr>
+        <w:lastRenderedPageBreak/>
+        <w:t>R</w:t>
+      </w:r>
+      <w:r>
+        <w:rPr>
+          <w:b/>
+          <w:sz w:val="28"/>
+        </w:rPr>
+        <w:t xml:space="preserve">15 </w:t>
+      </w:r>
+      <w:r>
+        <w:rPr>
+          <w:b/>
+          <w:sz w:val="28"/>
+        </w:rPr>
+        <w:t>Продажа сборки должна быть привязана к сущности заказа клиента</w:t>
+      </w:r>
+    </w:p>
+    <w:p>
+      <w:pPr>
+        <w:spacing w:after="0" w:line="259" w:lineRule="auto"/>
+        <w:ind w:right="0" w:firstLine="0"/>
+        <w:jc w:val="left"/>
+        <w:rPr>
+          <w:b/>
+          <w:sz w:val="28"/>
+        </w:rPr>
+      </w:pPr>
+      <w:r>
+        <w:rPr>
+          <w:b/>
+          <w:sz w:val="28"/>
+          <w:lang w:val="en-US"/>
+        </w:rPr>
+        <w:t>R</w:t>
+      </w:r>
+      <w:r>
+        <w:rPr>
+          <w:b/>
+          <w:sz w:val="28"/>
+        </w:rPr>
+        <w:t xml:space="preserve">16 </w:t>
+      </w:r>
+      <w:r>
+        <w:rPr>
+          <w:b/>
+          <w:sz w:val="28"/>
+        </w:rPr>
+        <w:t>При продажи сборки должны быть сообщены все серийные номера</w:t>
+      </w:r>
+    </w:p>
+    <w:p>
+      <w:pPr>
+        <w:spacing w:after="0" w:line="259" w:lineRule="auto"/>
+        <w:ind w:right="0" w:firstLine="0"/>
+        <w:jc w:val="left"/>
+        <w:rPr>
+          <w:b/>
+          <w:sz w:val="28"/>
+        </w:rPr>
+      </w:pPr>
+      <w:r>
+        <w:rPr>
+          <w:b/>
+          <w:sz w:val="28"/>
+          <w:lang w:val="en-US"/>
+        </w:rPr>
+        <w:t>R</w:t>
+      </w:r>
+      <w:r>
+        <w:rPr>
+          <w:b/>
+          <w:sz w:val="28"/>
+        </w:rPr>
+        <w:t xml:space="preserve">17 </w:t>
+      </w:r>
+      <w:r>
+        <w:rPr>
+          <w:b/>
+          <w:sz w:val="28"/>
+        </w:rPr>
+        <w:t>Некоторая сборка или некоторый экземпляр комплектующей может быть продан лишь один раз</w:t>
+      </w:r>
+    </w:p>
+    <w:p>
+      <w:pPr>
+        <w:spacing w:after="0" w:line="259" w:lineRule="auto"/>
+        <w:ind w:right="0" w:firstLine="0"/>
+        <w:jc w:val="left"/>
+        <w:rPr>
+          <w:b/>
+          <w:sz w:val="28"/>
+        </w:rPr>
+      </w:pPr>
+      <w:r>
+        <w:rPr>
+          <w:b/>
+          <w:sz w:val="28"/>
+          <w:lang w:val="en-US"/>
+        </w:rPr>
+        <w:t>R</w:t>
+      </w:r>
+      <w:r>
+        <w:rPr>
+          <w:b/>
+          <w:sz w:val="28"/>
+        </w:rPr>
+        <w:t xml:space="preserve">18 </w:t>
+      </w:r>
+      <w:r>
+        <w:rPr>
+          <w:b/>
+          <w:sz w:val="28"/>
+        </w:rPr>
+        <w:t>Гарантийное обращение должно иметь основание</w:t>
+      </w:r>
     </w:p>
     <w:p>
       <w:pPr>
@@ -533,7 +1193,7 @@
         </w:tc>
         <w:tc>
           <w:tcPr>
-            <w:tcW w:w="4458" w:type="dxa"/>
+            <w:tcW w:w="4460" w:type="dxa"/>
             <w:tcBorders>
               <w:top w:val="single" w:sz="8" w:space="0" w:color="000000"/>
               <w:left w:val="single" w:sz="8" w:space="0" w:color="000000"/>
@@ -659,7 +1319,7 @@
         </w:tc>
         <w:tc>
           <w:tcPr>
-            <w:tcW w:w="4458" w:type="dxa"/>
+            <w:tcW w:w="4460" w:type="dxa"/>
             <w:tcBorders>
               <w:top w:val="single" w:sz="8" w:space="0" w:color="000000"/>
               <w:left w:val="single" w:sz="8" w:space="0" w:color="000000"/>
@@ -696,19 +1356,6 @@
                 <w:sz w:val="22"/>
               </w:rPr>
               <w:t>цена</w:t>
-            </w:r>
-            <w:r>
-              <w:rPr>
-                <w:sz w:val="22"/>
-              </w:rPr>
-              <w:t xml:space="preserve">, </w:t>
-            </w:r>
-            <w:r>
-              <w:rPr>
-                <w:color w:val="385623" w:themeColor="accent6" w:themeShade="80"/>
-                <w:sz w:val="22"/>
-              </w:rPr>
-              <w:t>бренд</w:t>
             </w:r>
             <w:r>
               <w:rPr>
@@ -812,7 +1459,39 @@
               <w:rPr>
                 <w:sz w:val="22"/>
               </w:rPr>
-              <w:t xml:space="preserve">Категория, </w:t>
+              <w:t>Категория</w:t>
+            </w:r>
+            <w:r>
+              <w:rPr>
+                <w:sz w:val="22"/>
+              </w:rPr>
+              <w:t xml:space="preserve"> </w:t>
+            </w:r>
+            <w:proofErr w:type="gramStart"/>
+            <w:r>
+              <w:rPr>
+                <w:sz w:val="22"/>
+              </w:rPr>
+              <w:t>комплектующей</w:t>
+            </w:r>
+            <w:r>
+              <w:rPr>
+                <w:sz w:val="22"/>
+              </w:rPr>
+              <w:t xml:space="preserve"> </w:t>
+            </w:r>
+            <w:r>
+              <w:rPr>
+                <w:sz w:val="22"/>
+              </w:rPr>
+              <w:t>,</w:t>
+            </w:r>
+            <w:proofErr w:type="gramEnd"/>
+            <w:r>
+              <w:rPr>
+                <w:sz w:val="22"/>
+              </w:rPr>
+              <w:t xml:space="preserve"> </w:t>
             </w:r>
             <w:r>
               <w:rPr>
@@ -857,7 +1536,7 @@
         </w:tc>
         <w:tc>
           <w:tcPr>
-            <w:tcW w:w="4458" w:type="dxa"/>
+            <w:tcW w:w="4460" w:type="dxa"/>
             <w:tcBorders>
               <w:top w:val="single" w:sz="8" w:space="0" w:color="000000"/>
               <w:left w:val="single" w:sz="8" w:space="0" w:color="000000"/>
@@ -914,7 +1593,7 @@
               <w:rPr>
                 <w:sz w:val="22"/>
               </w:rPr>
-              <w:t xml:space="preserve">родительская категория при наличии </w:t>
+              <w:t>родительская категория</w:t>
             </w:r>
           </w:p>
         </w:tc>
@@ -1008,7 +1687,7 @@
         </w:tc>
         <w:tc>
           <w:tcPr>
-            <w:tcW w:w="4458" w:type="dxa"/>
+            <w:tcW w:w="4460" w:type="dxa"/>
             <w:tcBorders>
               <w:top w:val="single" w:sz="8" w:space="0" w:color="000000"/>
               <w:left w:val="single" w:sz="8" w:space="0" w:color="000000"/>
@@ -1113,7 +1792,7 @@
         </w:tc>
         <w:tc>
           <w:tcPr>
-            <w:tcW w:w="4458" w:type="dxa"/>
+            <w:tcW w:w="4460" w:type="dxa"/>
             <w:tcBorders>
               <w:top w:val="single" w:sz="8" w:space="0" w:color="000000"/>
               <w:left w:val="single" w:sz="8" w:space="0" w:color="000000"/>
@@ -1136,7 +1815,7 @@
               <w:rPr>
                 <w:sz w:val="22"/>
               </w:rPr>
-              <w:t>комплектую</w:t>
+              <w:t>модель комплектующей</w:t>
             </w:r>
             <w:r>
               <w:rPr>
@@ -1239,7 +1918,7 @@
         </w:tc>
         <w:tc>
           <w:tcPr>
-            <w:tcW w:w="4458" w:type="dxa"/>
+            <w:tcW w:w="4460" w:type="dxa"/>
             <w:tcBorders>
               <w:top w:val="single" w:sz="8" w:space="0" w:color="000000"/>
               <w:left w:val="single" w:sz="8" w:space="0" w:color="000000"/>
@@ -1297,7 +1976,21 @@
                 <w:color w:val="806000" w:themeColor="accent4" w:themeShade="80"/>
                 <w:sz w:val="22"/>
               </w:rPr>
-              <w:t>аргумент 1, компаратор, аргумент 2, дата создания, дата отказа</w:t>
+              <w:t xml:space="preserve">аргумент 1, компаратор, аргумент 2, </w:t>
+            </w:r>
+            <w:r>
+              <w:rPr>
+                <w:color w:val="806000" w:themeColor="accent4" w:themeShade="80"/>
+                <w:sz w:val="22"/>
+              </w:rPr>
+              <w:t xml:space="preserve">тип, </w:t>
+            </w:r>
+            <w:r>
+              <w:rPr>
+                <w:color w:val="806000" w:themeColor="accent4" w:themeShade="80"/>
+                <w:sz w:val="22"/>
+              </w:rPr>
+              <w:t>дата создания, дата отказа</w:t>
             </w:r>
             <w:r>
               <w:rPr>
@@ -1317,7 +2010,13 @@
               <w:rPr>
                 <w:sz w:val="22"/>
               </w:rPr>
-              <w:t xml:space="preserve">статус </w:t>
+              <w:t>статус</w:t>
+            </w:r>
+            <w:r>
+              <w:rPr>
+                <w:sz w:val="22"/>
+              </w:rPr>
+              <w:t>, сообщение об ошибке</w:t>
             </w:r>
           </w:p>
         </w:tc>
@@ -1423,7 +2122,7 @@
         </w:tc>
         <w:tc>
           <w:tcPr>
-            <w:tcW w:w="4458" w:type="dxa"/>
+            <w:tcW w:w="4460" w:type="dxa"/>
             <w:tcBorders>
               <w:top w:val="single" w:sz="8" w:space="0" w:color="000000"/>
               <w:left w:val="single" w:sz="8" w:space="0" w:color="000000"/>
@@ -1501,7 +2200,6 @@
               <w:rPr>
                 <w:sz w:val="22"/>
               </w:rPr>
-              <w:lastRenderedPageBreak/>
               <w:t xml:space="preserve">E7 </w:t>
             </w:r>
           </w:p>
@@ -1573,7 +2271,7 @@
         </w:tc>
         <w:tc>
           <w:tcPr>
-            <w:tcW w:w="4458" w:type="dxa"/>
+            <w:tcW w:w="4460" w:type="dxa"/>
             <w:tcBorders>
               <w:top w:val="single" w:sz="8" w:space="0" w:color="000000"/>
               <w:left w:val="single" w:sz="8" w:space="0" w:color="000000"/>
@@ -1603,7 +2301,19 @@
               <w:rPr>
                 <w:sz w:val="22"/>
               </w:rPr>
-              <w:t xml:space="preserve">ответственного, статус </w:t>
+              <w:t>ответственного, статус</w:t>
+            </w:r>
+            <w:r>
+              <w:rPr>
+                <w:sz w:val="22"/>
+              </w:rPr>
+              <w:t>, общая стоимость поставки</w:t>
+            </w:r>
+            <w:r>
+              <w:rPr>
+                <w:sz w:val="22"/>
+              </w:rPr>
+              <w:t>, комментарий</w:t>
             </w:r>
           </w:p>
         </w:tc>
@@ -1751,13 +2461,37 @@
               <w:rPr>
                 <w:sz w:val="22"/>
               </w:rPr>
-              <w:t>комплектующую</w:t>
-            </w:r>
-            <w:r>
-              <w:rPr>
-                <w:sz w:val="22"/>
-              </w:rPr>
-              <w:t>, номер партии, дат</w:t>
+              <w:t xml:space="preserve">модель </w:t>
+            </w:r>
+            <w:r>
+              <w:rPr>
+                <w:sz w:val="22"/>
+              </w:rPr>
+              <w:t>комплектующ</w:t>
+            </w:r>
+            <w:r>
+              <w:rPr>
+                <w:sz w:val="22"/>
+              </w:rPr>
+              <w:t>ей</w:t>
+            </w:r>
+            <w:r>
+              <w:rPr>
+                <w:sz w:val="22"/>
+              </w:rPr>
+              <w:t xml:space="preserve">, </w:t>
+            </w:r>
+            <w:r>
+              <w:rPr>
+                <w:sz w:val="22"/>
+              </w:rPr>
+              <w:t xml:space="preserve">поставку, </w:t>
+            </w:r>
+            <w:r>
+              <w:rPr>
+                <w:sz w:val="22"/>
+              </w:rPr>
+              <w:t>номер партии, дат</w:t>
             </w:r>
             <w:r>
               <w:rPr>
@@ -2052,7 +2786,25 @@
               <w:rPr>
                 <w:sz w:val="22"/>
               </w:rPr>
-              <w:t xml:space="preserve">, стоимость, текущий статус, ответственный </w:t>
+              <w:t>, стоимость,</w:t>
+            </w:r>
+            <w:r>
+              <w:rPr>
+                <w:sz w:val="22"/>
+              </w:rPr>
+              <w:t xml:space="preserve"> </w:t>
+            </w:r>
+            <w:r>
+              <w:rPr>
+                <w:sz w:val="22"/>
+              </w:rPr>
+              <w:t>статус, ответственный</w:t>
+            </w:r>
+            <w:r>
+              <w:rPr>
+                <w:sz w:val="22"/>
+              </w:rPr>
+              <w:t>, комментарий</w:t>
             </w:r>
           </w:p>
         </w:tc>
@@ -2185,7 +2937,15 @@
                 <w:color w:val="806000" w:themeColor="accent4" w:themeShade="80"/>
                 <w:sz w:val="22"/>
               </w:rPr>
-              <w:t>перечень комплектующих</w:t>
+              <w:t xml:space="preserve">перечень </w:t>
+            </w:r>
+            <w:proofErr w:type="gramStart"/>
+            <w:r>
+              <w:rPr>
+                <w:color w:val="806000" w:themeColor="accent4" w:themeShade="80"/>
+                <w:sz w:val="22"/>
+              </w:rPr>
+              <w:t>комплектующих</w:t>
             </w:r>
             <w:r>
               <w:rPr>
@@ -2197,7 +2957,20 @@
               <w:rPr>
                 <w:sz w:val="22"/>
               </w:rPr>
-              <w:t xml:space="preserve">, статус </w:t>
+              <w:t>,</w:t>
+            </w:r>
+            <w:proofErr w:type="gramEnd"/>
+            <w:r>
+              <w:rPr>
+                <w:sz w:val="22"/>
+              </w:rPr>
+              <w:t xml:space="preserve"> статус</w:t>
+            </w:r>
+            <w:r>
+              <w:rPr>
+                <w:sz w:val="22"/>
+              </w:rPr>
+              <w:t>, заказ клиента, результат проверки совместимости</w:t>
             </w:r>
           </w:p>
         </w:tc>
@@ -2232,6 +3005,7 @@
               <w:rPr>
                 <w:sz w:val="22"/>
               </w:rPr>
+              <w:lastRenderedPageBreak/>
               <w:t xml:space="preserve">E12 </w:t>
             </w:r>
           </w:p>
@@ -2314,13 +3088,31 @@
               <w:rPr>
                 <w:sz w:val="22"/>
               </w:rPr>
-              <w:t xml:space="preserve">Содержит родительский объект, </w:t>
-            </w:r>
-            <w:r>
-              <w:rPr>
-                <w:sz w:val="22"/>
-              </w:rPr>
-              <w:t xml:space="preserve">экземпляр </w:t>
+              <w:t xml:space="preserve">Содержит </w:t>
+            </w:r>
+            <w:r>
+              <w:rPr>
+                <w:sz w:val="22"/>
+              </w:rPr>
+              <w:t>конфигурацию сборки</w:t>
+            </w:r>
+            <w:r>
+              <w:rPr>
+                <w:sz w:val="22"/>
+              </w:rPr>
+              <w:t xml:space="preserve">, </w:t>
+            </w:r>
+            <w:r>
+              <w:rPr>
+                <w:sz w:val="22"/>
+              </w:rPr>
+              <w:t>модель</w:t>
+            </w:r>
+            <w:r>
+              <w:rPr>
+                <w:sz w:val="22"/>
+              </w:rPr>
+              <w:t xml:space="preserve"> </w:t>
             </w:r>
             <w:r>
               <w:rPr>
@@ -2332,7 +3124,7 @@
               <w:rPr>
                 <w:sz w:val="22"/>
               </w:rPr>
-              <w:t xml:space="preserve">, количество, роль </w:t>
+              <w:t>, количество</w:t>
             </w:r>
           </w:p>
         </w:tc>
@@ -2362,14 +3154,10 @@
               <w:spacing w:after="0" w:line="259" w:lineRule="auto"/>
               <w:ind w:right="55" w:firstLine="0"/>
               <w:jc w:val="center"/>
-              <w:rPr>
-                <w:highlight w:val="lightGray"/>
-              </w:rPr>
-            </w:pPr>
-            <w:r>
-              <w:rPr>
-                <w:sz w:val="22"/>
-                <w:highlight w:val="lightGray"/>
+            </w:pPr>
+            <w:r>
+              <w:rPr>
+                <w:sz w:val="22"/>
               </w:rPr>
               <w:t xml:space="preserve">E13 </w:t>
             </w:r>
@@ -2390,14 +3178,10 @@
               <w:spacing w:after="0" w:line="259" w:lineRule="auto"/>
               <w:ind w:right="0" w:firstLine="0"/>
               <w:jc w:val="left"/>
-              <w:rPr>
-                <w:highlight w:val="lightGray"/>
-              </w:rPr>
-            </w:pPr>
-            <w:r>
-              <w:rPr>
-                <w:sz w:val="22"/>
-                <w:highlight w:val="lightGray"/>
+            </w:pPr>
+            <w:r>
+              <w:rPr>
+                <w:sz w:val="22"/>
               </w:rPr>
               <w:t xml:space="preserve">Резерв экземпляра </w:t>
             </w:r>
@@ -2418,21 +3202,16 @@
               <w:spacing w:after="0" w:line="259" w:lineRule="auto"/>
               <w:ind w:left="10" w:right="0" w:firstLine="0"/>
               <w:jc w:val="left"/>
-              <w:rPr>
-                <w:highlight w:val="lightGray"/>
-              </w:rPr>
-            </w:pPr>
-            <w:r>
-              <w:rPr>
-                <w:sz w:val="22"/>
-                <w:highlight w:val="lightGray"/>
+            </w:pPr>
+            <w:r>
+              <w:rPr>
+                <w:sz w:val="22"/>
               </w:rPr>
               <w:t xml:space="preserve">Запись, </w:t>
             </w:r>
             <w:r>
               <w:rPr>
                 <w:sz w:val="22"/>
-                <w:highlight w:val="lightGray"/>
               </w:rPr>
               <w:tab/>
               <w:t xml:space="preserve">фиксирующая </w:t>
@@ -2440,10 +3219,21 @@
             <w:r>
               <w:rPr>
                 <w:sz w:val="22"/>
-                <w:highlight w:val="lightGray"/>
               </w:rPr>
               <w:tab/>
-              <w:t xml:space="preserve">временное резервирование объекта для конкретного заказа или пользователя </w:t>
+              <w:t xml:space="preserve">временное резервирование </w:t>
+            </w:r>
+            <w:r>
+              <w:rPr>
+                <w:sz w:val="22"/>
+              </w:rPr>
+              <w:t>комплектующей</w:t>
+            </w:r>
+            <w:r>
+              <w:rPr>
+                <w:sz w:val="22"/>
+              </w:rPr>
+              <w:t xml:space="preserve"> для конкретного заказа или пользователя </w:t>
             </w:r>
           </w:p>
         </w:tc>
@@ -2461,32 +3251,54 @@
             <w:pPr>
               <w:spacing w:after="0" w:line="259" w:lineRule="auto"/>
               <w:ind w:left="5" w:right="0" w:firstLine="0"/>
-              <w:rPr>
-                <w:highlight w:val="lightGray"/>
-              </w:rPr>
-            </w:pPr>
-            <w:r>
-              <w:rPr>
-                <w:sz w:val="22"/>
-                <w:highlight w:val="lightGray"/>
-              </w:rPr>
-              <w:t xml:space="preserve">Содержит объект, заказ или пользователь, </w:t>
-            </w:r>
-          </w:p>
-          <w:p>
-            <w:pPr>
-              <w:spacing w:after="0" w:line="259" w:lineRule="auto"/>
-              <w:ind w:left="5" w:right="0" w:firstLine="0"/>
-              <w:rPr>
-                <w:highlight w:val="lightGray"/>
-              </w:rPr>
-            </w:pPr>
-            <w:r>
-              <w:rPr>
-                <w:sz w:val="22"/>
-                <w:highlight w:val="lightGray"/>
-              </w:rPr>
-              <w:t xml:space="preserve">количество при наличии, дата и время создания, срок действия, статус </w:t>
+            </w:pPr>
+            <w:r>
+              <w:rPr>
+                <w:sz w:val="22"/>
+              </w:rPr>
+              <w:t xml:space="preserve">Содержит </w:t>
+            </w:r>
+            <w:r>
+              <w:rPr>
+                <w:sz w:val="22"/>
+              </w:rPr>
+              <w:t>экземпляр товара</w:t>
+            </w:r>
+            <w:r>
+              <w:rPr>
+                <w:sz w:val="22"/>
+              </w:rPr>
+              <w:t xml:space="preserve">, </w:t>
+            </w:r>
+            <w:r>
+              <w:rPr>
+                <w:sz w:val="22"/>
+              </w:rPr>
+              <w:t>заказ</w:t>
+            </w:r>
+            <w:r>
+              <w:rPr>
+                <w:sz w:val="22"/>
+              </w:rPr>
+              <w:t xml:space="preserve"> клиента</w:t>
+            </w:r>
+            <w:r>
+              <w:rPr>
+                <w:sz w:val="22"/>
+              </w:rPr>
+              <w:t>, дат</w:t>
+            </w:r>
+            <w:r>
+              <w:rPr>
+                <w:sz w:val="22"/>
+              </w:rPr>
+              <w:t>у</w:t>
+            </w:r>
+            <w:r>
+              <w:rPr>
+                <w:sz w:val="22"/>
+              </w:rPr>
+              <w:t xml:space="preserve"> и время создания, срок действия, статус </w:t>
             </w:r>
           </w:p>
         </w:tc>
@@ -2516,14 +3328,10 @@
               <w:spacing w:after="0" w:line="259" w:lineRule="auto"/>
               <w:ind w:right="55" w:firstLine="0"/>
               <w:jc w:val="center"/>
-              <w:rPr>
-                <w:highlight w:val="lightGray"/>
-              </w:rPr>
-            </w:pPr>
-            <w:r>
-              <w:rPr>
-                <w:sz w:val="22"/>
-                <w:highlight w:val="lightGray"/>
+            </w:pPr>
+            <w:r>
+              <w:rPr>
+                <w:sz w:val="22"/>
               </w:rPr>
               <w:t xml:space="preserve">E14 </w:t>
             </w:r>
@@ -2544,14 +3352,10 @@
               <w:spacing w:after="0" w:line="259" w:lineRule="auto"/>
               <w:ind w:right="0" w:firstLine="0"/>
               <w:jc w:val="left"/>
-              <w:rPr>
-                <w:highlight w:val="lightGray"/>
-              </w:rPr>
-            </w:pPr>
-            <w:r>
-              <w:rPr>
-                <w:sz w:val="22"/>
-                <w:highlight w:val="lightGray"/>
+            </w:pPr>
+            <w:r>
+              <w:rPr>
+                <w:sz w:val="22"/>
               </w:rPr>
               <w:t xml:space="preserve">Сборка </w:t>
             </w:r>
@@ -2571,16 +3375,9 @@
             <w:pPr>
               <w:spacing w:after="0" w:line="259" w:lineRule="auto"/>
               <w:ind w:left="10" w:right="0" w:firstLine="0"/>
-              <w:rPr>
-                <w:highlight w:val="lightGray"/>
-              </w:rPr>
-            </w:pPr>
-            <w:r>
-              <w:rPr>
-                <w:sz w:val="22"/>
-                <w:highlight w:val="lightGray"/>
-              </w:rPr>
-              <w:t xml:space="preserve">Отдельный результат запуска процесса сборки программного продукта </w:t>
+            </w:pPr>
+            <w:r>
+              <w:t>ПК, собранный на основе конфигурации сборки</w:t>
             </w:r>
           </w:p>
         </w:tc>
@@ -2598,16 +3395,92 @@
             <w:pPr>
               <w:spacing w:after="0" w:line="259" w:lineRule="auto"/>
               <w:ind w:left="5" w:right="65" w:firstLine="0"/>
-              <w:rPr>
-                <w:highlight w:val="lightGray"/>
-              </w:rPr>
-            </w:pPr>
-            <w:r>
-              <w:rPr>
-                <w:sz w:val="22"/>
-                <w:highlight w:val="lightGray"/>
-              </w:rPr>
-              <w:t xml:space="preserve">Содержит идентификатор, конфигурация, дата и время запуска, архитектура, результат, журнал, статус </w:t>
+            </w:pPr>
+            <w:r>
+              <w:rPr>
+                <w:sz w:val="22"/>
+              </w:rPr>
+              <w:t xml:space="preserve">Содержит </w:t>
+            </w:r>
+            <w:r>
+              <w:rPr>
+                <w:sz w:val="22"/>
+              </w:rPr>
+              <w:t>номер</w:t>
+            </w:r>
+            <w:r>
+              <w:rPr>
+                <w:sz w:val="22"/>
+              </w:rPr>
+              <w:t>, конфигураци</w:t>
+            </w:r>
+            <w:r>
+              <w:rPr>
+                <w:sz w:val="22"/>
+              </w:rPr>
+              <w:t xml:space="preserve">я </w:t>
+            </w:r>
+            <w:proofErr w:type="gramStart"/>
+            <w:r>
+              <w:rPr>
+                <w:sz w:val="22"/>
+              </w:rPr>
+              <w:t>сборки</w:t>
+            </w:r>
+            <w:r>
+              <w:rPr>
+                <w:sz w:val="22"/>
+              </w:rPr>
+              <w:t>,</w:t>
+            </w:r>
+            <w:r>
+              <w:rPr>
+                <w:sz w:val="22"/>
+              </w:rPr>
+              <w:t xml:space="preserve"> </w:t>
+            </w:r>
+            <w:r>
+              <w:rPr>
+                <w:sz w:val="22"/>
+              </w:rPr>
+              <w:t xml:space="preserve"> дата</w:t>
+            </w:r>
+            <w:proofErr w:type="gramEnd"/>
+            <w:r>
+              <w:rPr>
+                <w:sz w:val="22"/>
+              </w:rPr>
+              <w:t xml:space="preserve"> и время </w:t>
+            </w:r>
+            <w:r>
+              <w:rPr>
+                <w:sz w:val="22"/>
+              </w:rPr>
+              <w:t>сборки</w:t>
+            </w:r>
+            <w:r>
+              <w:rPr>
+                <w:sz w:val="22"/>
+              </w:rPr>
+              <w:t xml:space="preserve">, </w:t>
+            </w:r>
+            <w:r>
+              <w:rPr>
+                <w:sz w:val="22"/>
+              </w:rPr>
+              <w:t>тест сборки</w:t>
+            </w:r>
+            <w:r>
+              <w:rPr>
+                <w:sz w:val="22"/>
+              </w:rPr>
+              <w:t>, статус</w:t>
+            </w:r>
+            <w:r>
+              <w:rPr>
+                <w:sz w:val="22"/>
+              </w:rPr>
+              <w:t>, комментарий, сборщик</w:t>
             </w:r>
           </w:p>
         </w:tc>
@@ -2637,14 +3510,10 @@
               <w:spacing w:after="0" w:line="259" w:lineRule="auto"/>
               <w:ind w:right="55" w:firstLine="0"/>
               <w:jc w:val="center"/>
-              <w:rPr>
-                <w:highlight w:val="lightGray"/>
-              </w:rPr>
-            </w:pPr>
-            <w:r>
-              <w:rPr>
-                <w:sz w:val="22"/>
-                <w:highlight w:val="lightGray"/>
+            </w:pPr>
+            <w:r>
+              <w:rPr>
+                <w:sz w:val="22"/>
               </w:rPr>
               <w:t xml:space="preserve">E15 </w:t>
             </w:r>
@@ -2665,14 +3534,10 @@
               <w:spacing w:after="0" w:line="259" w:lineRule="auto"/>
               <w:ind w:right="0" w:firstLine="0"/>
               <w:jc w:val="left"/>
-              <w:rPr>
-                <w:highlight w:val="lightGray"/>
-              </w:rPr>
-            </w:pPr>
-            <w:r>
-              <w:rPr>
-                <w:sz w:val="22"/>
-                <w:highlight w:val="lightGray"/>
+            </w:pPr>
+            <w:r>
+              <w:rPr>
+                <w:sz w:val="22"/>
               </w:rPr>
               <w:t xml:space="preserve">Тест сборки </w:t>
             </w:r>
@@ -2692,14 +3557,10 @@
             <w:pPr>
               <w:spacing w:after="0" w:line="259" w:lineRule="auto"/>
               <w:ind w:left="10" w:right="0" w:firstLine="0"/>
-              <w:rPr>
-                <w:highlight w:val="lightGray"/>
-              </w:rPr>
-            </w:pPr>
-            <w:r>
-              <w:rPr>
-                <w:sz w:val="22"/>
-                <w:highlight w:val="lightGray"/>
+            </w:pPr>
+            <w:r>
+              <w:rPr>
+                <w:sz w:val="22"/>
               </w:rPr>
               <w:t xml:space="preserve">Документ, фиксирующий проведение проверки или контроля «Тест сборки» </w:t>
             </w:r>
@@ -2719,16 +3580,36 @@
             <w:pPr>
               <w:spacing w:after="0" w:line="259" w:lineRule="auto"/>
               <w:ind w:left="5" w:right="69" w:firstLine="0"/>
-              <w:rPr>
-                <w:highlight w:val="lightGray"/>
-              </w:rPr>
-            </w:pPr>
-            <w:r>
-              <w:rPr>
-                <w:sz w:val="22"/>
-                <w:highlight w:val="lightGray"/>
-              </w:rPr>
-              <w:t xml:space="preserve">Содержит проверяемый объект, дата и время, вид проверки, результат, ответственный, комментарий </w:t>
+            </w:pPr>
+            <w:r>
+              <w:rPr>
+                <w:sz w:val="22"/>
+              </w:rPr>
+              <w:t xml:space="preserve">Содержит </w:t>
+            </w:r>
+            <w:r>
+              <w:rPr>
+                <w:sz w:val="22"/>
+              </w:rPr>
+              <w:t>название,</w:t>
+            </w:r>
+            <w:r>
+              <w:rPr>
+                <w:sz w:val="22"/>
+              </w:rPr>
+              <w:t xml:space="preserve"> </w:t>
+            </w:r>
+            <w:r>
+              <w:rPr>
+                <w:sz w:val="22"/>
+              </w:rPr>
+              <w:t>обязательность, статус</w:t>
+            </w:r>
+            <w:r>
+              <w:rPr>
+                <w:sz w:val="22"/>
+              </w:rPr>
+              <w:t xml:space="preserve"> </w:t>
             </w:r>
           </w:p>
         </w:tc>
@@ -2758,14 +3639,10 @@
               <w:spacing w:after="0" w:line="259" w:lineRule="auto"/>
               <w:ind w:right="55" w:firstLine="0"/>
               <w:jc w:val="center"/>
-              <w:rPr>
-                <w:highlight w:val="lightGray"/>
-              </w:rPr>
-            </w:pPr>
-            <w:r>
-              <w:rPr>
-                <w:sz w:val="22"/>
-                <w:highlight w:val="lightGray"/>
+            </w:pPr>
+            <w:r>
+              <w:rPr>
+                <w:sz w:val="22"/>
               </w:rPr>
               <w:t xml:space="preserve">E16 </w:t>
             </w:r>
@@ -2786,14 +3663,10 @@
               <w:spacing w:after="0" w:line="259" w:lineRule="auto"/>
               <w:ind w:right="0" w:firstLine="0"/>
               <w:jc w:val="left"/>
-              <w:rPr>
-                <w:highlight w:val="lightGray"/>
-              </w:rPr>
-            </w:pPr>
-            <w:r>
-              <w:rPr>
-                <w:sz w:val="22"/>
-                <w:highlight w:val="lightGray"/>
+            </w:pPr>
+            <w:r>
+              <w:rPr>
+                <w:sz w:val="22"/>
               </w:rPr>
               <w:t xml:space="preserve">Результат теста </w:t>
             </w:r>
@@ -2814,14 +3687,10 @@
               <w:spacing w:after="0" w:line="259" w:lineRule="auto"/>
               <w:ind w:left="10" w:right="0" w:firstLine="0"/>
               <w:jc w:val="left"/>
-              <w:rPr>
-                <w:highlight w:val="lightGray"/>
-              </w:rPr>
-            </w:pPr>
-            <w:r>
-              <w:rPr>
-                <w:sz w:val="22"/>
-                <w:highlight w:val="lightGray"/>
+            </w:pPr>
+            <w:r>
+              <w:rPr>
+                <w:sz w:val="22"/>
               </w:rPr>
               <w:t xml:space="preserve">Результат выполнения операции или проверки «теста» </w:t>
             </w:r>
@@ -2841,33 +3710,36 @@
             <w:pPr>
               <w:spacing w:after="0"/>
               <w:ind w:left="5" w:right="0" w:firstLine="0"/>
-              <w:rPr>
-                <w:highlight w:val="lightGray"/>
-              </w:rPr>
-            </w:pPr>
-            <w:r>
-              <w:rPr>
-                <w:sz w:val="22"/>
-                <w:highlight w:val="lightGray"/>
-              </w:rPr>
-              <w:t xml:space="preserve">Содержит связанный объект, дата и время, фактический результат, статус, </w:t>
-            </w:r>
-          </w:p>
-          <w:p>
-            <w:pPr>
-              <w:spacing w:after="0" w:line="259" w:lineRule="auto"/>
-              <w:ind w:left="5" w:right="0" w:firstLine="0"/>
-              <w:jc w:val="left"/>
-              <w:rPr>
-                <w:highlight w:val="lightGray"/>
-              </w:rPr>
-            </w:pPr>
-            <w:r>
-              <w:rPr>
-                <w:sz w:val="22"/>
-                <w:highlight w:val="lightGray"/>
-              </w:rPr>
-              <w:t xml:space="preserve">ответственный, комментарий </w:t>
+            </w:pPr>
+            <w:r>
+              <w:rPr>
+                <w:sz w:val="22"/>
+              </w:rPr>
+              <w:t xml:space="preserve">Содержит </w:t>
+            </w:r>
+            <w:r>
+              <w:rPr>
+                <w:sz w:val="22"/>
+              </w:rPr>
+              <w:t>сборку</w:t>
+            </w:r>
+            <w:r>
+              <w:rPr>
+                <w:sz w:val="22"/>
+              </w:rPr>
+              <w:t>,</w:t>
+            </w:r>
+            <w:r>
+              <w:rPr>
+                <w:sz w:val="22"/>
+              </w:rPr>
+              <w:t xml:space="preserve"> тест сборки,</w:t>
+            </w:r>
+            <w:r>
+              <w:rPr>
+                <w:sz w:val="22"/>
+              </w:rPr>
+              <w:t xml:space="preserve"> дата и время, результат, статус, ответственный, комментарий </w:t>
             </w:r>
           </w:p>
         </w:tc>
@@ -2897,14 +3769,10 @@
               <w:spacing w:after="0" w:line="259" w:lineRule="auto"/>
               <w:ind w:right="55" w:firstLine="0"/>
               <w:jc w:val="center"/>
-              <w:rPr>
-                <w:highlight w:val="lightGray"/>
-              </w:rPr>
-            </w:pPr>
-            <w:r>
-              <w:rPr>
-                <w:sz w:val="22"/>
-                <w:highlight w:val="lightGray"/>
+            </w:pPr>
+            <w:r>
+              <w:rPr>
+                <w:sz w:val="22"/>
               </w:rPr>
               <w:t xml:space="preserve">E17 </w:t>
             </w:r>
@@ -2925,14 +3793,10 @@
               <w:spacing w:after="0" w:line="259" w:lineRule="auto"/>
               <w:ind w:right="0" w:firstLine="0"/>
               <w:jc w:val="left"/>
-              <w:rPr>
-                <w:highlight w:val="lightGray"/>
-              </w:rPr>
-            </w:pPr>
-            <w:r>
-              <w:rPr>
-                <w:sz w:val="22"/>
-                <w:highlight w:val="lightGray"/>
+            </w:pPr>
+            <w:r>
+              <w:rPr>
+                <w:sz w:val="22"/>
               </w:rPr>
               <w:t xml:space="preserve">Продажа </w:t>
             </w:r>
@@ -2952,16 +3816,24 @@
             <w:pPr>
               <w:spacing w:after="0" w:line="259" w:lineRule="auto"/>
               <w:ind w:left="10" w:right="0" w:firstLine="0"/>
-              <w:rPr>
-                <w:highlight w:val="lightGray"/>
-              </w:rPr>
-            </w:pPr>
-            <w:r>
-              <w:rPr>
-                <w:sz w:val="22"/>
-                <w:highlight w:val="lightGray"/>
-              </w:rPr>
-              <w:t xml:space="preserve">Документ, фиксирующий факт продажи товара покупателю </w:t>
+            </w:pPr>
+            <w:r>
+              <w:rPr>
+                <w:sz w:val="22"/>
+              </w:rPr>
+              <w:t xml:space="preserve">Документ, фиксирующий факт продажи </w:t>
+            </w:r>
+            <w:r>
+              <w:rPr>
+                <w:sz w:val="22"/>
+              </w:rPr>
+              <w:t>сборки</w:t>
+            </w:r>
+            <w:r>
+              <w:rPr>
+                <w:sz w:val="22"/>
+              </w:rPr>
+              <w:t xml:space="preserve"> покупателю </w:t>
             </w:r>
           </w:p>
         </w:tc>
@@ -2979,16 +3851,36 @@
             <w:pPr>
               <w:spacing w:after="0"/>
               <w:ind w:left="5" w:right="0" w:firstLine="0"/>
-              <w:rPr>
-                <w:highlight w:val="lightGray"/>
-              </w:rPr>
-            </w:pPr>
-            <w:r>
-              <w:rPr>
-                <w:sz w:val="22"/>
-                <w:highlight w:val="lightGray"/>
-              </w:rPr>
-              <w:t xml:space="preserve">Содержит номер, дата и время, покупатель при наличии, перечень товаров, стоимость, </w:t>
+            </w:pPr>
+            <w:r>
+              <w:rPr>
+                <w:sz w:val="22"/>
+              </w:rPr>
+              <w:t>Содержит номер, дата и время, покупатель,</w:t>
+            </w:r>
+            <w:r>
+              <w:rPr>
+                <w:sz w:val="22"/>
+              </w:rPr>
+              <w:t xml:space="preserve"> заказ клиента,</w:t>
+            </w:r>
+            <w:r>
+              <w:rPr>
+                <w:sz w:val="22"/>
+              </w:rPr>
+              <w:t xml:space="preserve"> </w:t>
+            </w:r>
+            <w:r>
+              <w:rPr>
+                <w:sz w:val="22"/>
+              </w:rPr>
+              <w:t>перечень товаров</w:t>
+            </w:r>
+            <w:r>
+              <w:rPr>
+                <w:sz w:val="22"/>
+              </w:rPr>
+              <w:t xml:space="preserve">, стоимость, </w:t>
             </w:r>
           </w:p>
           <w:p>
@@ -2996,14 +3888,10 @@
               <w:spacing w:after="0" w:line="259" w:lineRule="auto"/>
               <w:ind w:left="5" w:right="0" w:firstLine="0"/>
               <w:jc w:val="left"/>
-              <w:rPr>
-                <w:highlight w:val="lightGray"/>
-              </w:rPr>
-            </w:pPr>
-            <w:r>
-              <w:rPr>
-                <w:sz w:val="22"/>
-                <w:highlight w:val="lightGray"/>
+            </w:pPr>
+            <w:r>
+              <w:rPr>
+                <w:sz w:val="22"/>
               </w:rPr>
               <w:t xml:space="preserve">ответственный, статус </w:t>
             </w:r>
@@ -3035,14 +3923,10 @@
               <w:spacing w:after="0" w:line="259" w:lineRule="auto"/>
               <w:ind w:right="55" w:firstLine="0"/>
               <w:jc w:val="center"/>
-              <w:rPr>
-                <w:highlight w:val="lightGray"/>
-              </w:rPr>
-            </w:pPr>
-            <w:r>
-              <w:rPr>
-                <w:sz w:val="22"/>
-                <w:highlight w:val="lightGray"/>
+            </w:pPr>
+            <w:r>
+              <w:rPr>
+                <w:sz w:val="22"/>
               </w:rPr>
               <w:t xml:space="preserve">E18 </w:t>
             </w:r>
@@ -3063,14 +3947,10 @@
               <w:spacing w:after="0" w:line="259" w:lineRule="auto"/>
               <w:ind w:right="0" w:firstLine="0"/>
               <w:jc w:val="left"/>
-              <w:rPr>
-                <w:highlight w:val="lightGray"/>
-              </w:rPr>
-            </w:pPr>
-            <w:r>
-              <w:rPr>
-                <w:sz w:val="22"/>
-                <w:highlight w:val="lightGray"/>
+            </w:pPr>
+            <w:r>
+              <w:rPr>
+                <w:sz w:val="22"/>
               </w:rPr>
               <w:t xml:space="preserve">Гарантийное обращение </w:t>
             </w:r>
@@ -3090,14 +3970,10 @@
             <w:pPr>
               <w:spacing w:after="0" w:line="259" w:lineRule="auto"/>
               <w:ind w:left="10" w:right="56" w:firstLine="0"/>
-              <w:rPr>
-                <w:highlight w:val="lightGray"/>
-              </w:rPr>
-            </w:pPr>
-            <w:r>
-              <w:rPr>
-                <w:sz w:val="22"/>
-                <w:highlight w:val="lightGray"/>
+            </w:pPr>
+            <w:r>
+              <w:rPr>
+                <w:sz w:val="22"/>
               </w:rPr>
               <w:t xml:space="preserve">Обращение покупателя по поводу неисправности товара в гарантийный период </w:t>
             </w:r>
@@ -3117,16 +3993,36 @@
             <w:pPr>
               <w:spacing w:after="0"/>
               <w:ind w:left="5" w:right="0" w:firstLine="0"/>
-              <w:rPr>
-                <w:highlight w:val="lightGray"/>
-              </w:rPr>
-            </w:pPr>
-            <w:r>
-              <w:rPr>
-                <w:sz w:val="22"/>
-                <w:highlight w:val="lightGray"/>
-              </w:rPr>
-              <w:t xml:space="preserve">Содержит номер, покупатель, товар/экземпляр, дата, описание </w:t>
+            </w:pPr>
+            <w:r>
+              <w:rPr>
+                <w:sz w:val="22"/>
+              </w:rPr>
+              <w:t xml:space="preserve">Содержит номер, </w:t>
+            </w:r>
+            <w:r>
+              <w:rPr>
+                <w:sz w:val="22"/>
+              </w:rPr>
+              <w:t xml:space="preserve">дата, </w:t>
+            </w:r>
+            <w:r>
+              <w:rPr>
+                <w:sz w:val="22"/>
+              </w:rPr>
+              <w:t>покупатель,</w:t>
+            </w:r>
+            <w:r>
+              <w:rPr>
+                <w:sz w:val="22"/>
+              </w:rPr>
+              <w:t xml:space="preserve"> причина обращения</w:t>
+            </w:r>
+            <w:r>
+              <w:rPr>
+                <w:sz w:val="22"/>
+              </w:rPr>
+              <w:t xml:space="preserve">, описание </w:t>
             </w:r>
           </w:p>
           <w:p>
@@ -3134,20 +4030,226 @@
               <w:spacing w:after="0" w:line="259" w:lineRule="auto"/>
               <w:ind w:left="5" w:right="0" w:firstLine="0"/>
               <w:jc w:val="left"/>
-            </w:pPr>
-            <w:r>
-              <w:rPr>
-                <w:sz w:val="22"/>
-                <w:highlight w:val="lightGray"/>
-              </w:rPr>
-              <w:t>неисправности, гарантийные условия, статус</w:t>
-            </w:r>
-            <w:r>
-              <w:rPr>
-                <w:sz w:val="22"/>
-              </w:rPr>
-              <w:t xml:space="preserve"> </w:t>
-            </w:r>
+              <w:rPr>
+                <w:sz w:val="22"/>
+              </w:rPr>
+            </w:pPr>
+            <w:r>
+              <w:rPr>
+                <w:sz w:val="22"/>
+              </w:rPr>
+              <w:t xml:space="preserve">неисправности, гарантийные условия, статус </w:t>
+            </w:r>
+          </w:p>
+        </w:tc>
+      </w:tr>
+      <w:tr>
+        <w:tblPrEx>
+          <w:tblCellMar>
+            <w:top w:w="120" w:type="dxa"/>
+            <w:right w:w="8" w:type="dxa"/>
+          </w:tblCellMar>
+        </w:tblPrEx>
+        <w:trPr>
+          <w:trHeight w:val="900"/>
+        </w:trPr>
+        <w:tc>
+          <w:tcPr>
+            <w:tcW w:w="860" w:type="dxa"/>
+            <w:tcBorders>
+              <w:top w:val="single" w:sz="8" w:space="0" w:color="000000"/>
+              <w:left w:val="single" w:sz="8" w:space="0" w:color="000000"/>
+              <w:bottom w:val="single" w:sz="8" w:space="0" w:color="000000"/>
+              <w:right w:val="single" w:sz="8" w:space="0" w:color="000000"/>
+            </w:tcBorders>
+          </w:tcPr>
+          <w:p>
+            <w:pPr>
+              <w:spacing w:after="0" w:line="259" w:lineRule="auto"/>
+              <w:ind w:right="55" w:firstLine="0"/>
+              <w:jc w:val="center"/>
+              <w:rPr>
+                <w:sz w:val="22"/>
+              </w:rPr>
+            </w:pPr>
+            <w:r>
+              <w:rPr>
+                <w:sz w:val="22"/>
+              </w:rPr>
+              <w:t>Е19</w:t>
+            </w:r>
+          </w:p>
+        </w:tc>
+        <w:tc>
+          <w:tcPr>
+            <w:tcW w:w="1760" w:type="dxa"/>
+            <w:tcBorders>
+              <w:top w:val="single" w:sz="8" w:space="0" w:color="000000"/>
+              <w:left w:val="single" w:sz="8" w:space="0" w:color="000000"/>
+              <w:bottom w:val="single" w:sz="8" w:space="0" w:color="000000"/>
+              <w:right w:val="single" w:sz="8" w:space="0" w:color="000000"/>
+            </w:tcBorders>
+          </w:tcPr>
+          <w:p>
+            <w:pPr>
+              <w:spacing w:after="0" w:line="259" w:lineRule="auto"/>
+              <w:ind w:right="0" w:firstLine="0"/>
+              <w:jc w:val="left"/>
+              <w:rPr>
+                <w:sz w:val="22"/>
+              </w:rPr>
+            </w:pPr>
+            <w:r>
+              <w:rPr>
+                <w:sz w:val="22"/>
+              </w:rPr>
+              <w:t>Установленная комплектующая</w:t>
+            </w:r>
+          </w:p>
+        </w:tc>
+        <w:tc>
+          <w:tcPr>
+            <w:tcW w:w="3980" w:type="dxa"/>
+            <w:tcBorders>
+              <w:top w:val="single" w:sz="8" w:space="0" w:color="000000"/>
+              <w:left w:val="single" w:sz="8" w:space="0" w:color="000000"/>
+              <w:bottom w:val="single" w:sz="8" w:space="0" w:color="000000"/>
+              <w:right w:val="single" w:sz="8" w:space="0" w:color="000000"/>
+            </w:tcBorders>
+          </w:tcPr>
+          <w:p>
+            <w:pPr>
+              <w:spacing w:after="0" w:line="259" w:lineRule="auto"/>
+              <w:ind w:left="10" w:right="56" w:firstLine="0"/>
+              <w:rPr>
+                <w:sz w:val="22"/>
+              </w:rPr>
+            </w:pPr>
+            <w:r>
+              <w:rPr>
+                <w:sz w:val="22"/>
+              </w:rPr>
+              <w:t>Определенный экземпляр, установленный в некоторую сборку</w:t>
+            </w:r>
+          </w:p>
+        </w:tc>
+        <w:tc>
+          <w:tcPr>
+            <w:tcW w:w="4460" w:type="dxa"/>
+            <w:tcBorders>
+              <w:top w:val="single" w:sz="8" w:space="0" w:color="000000"/>
+              <w:left w:val="single" w:sz="8" w:space="0" w:color="000000"/>
+              <w:bottom w:val="single" w:sz="8" w:space="0" w:color="000000"/>
+              <w:right w:val="single" w:sz="8" w:space="0" w:color="000000"/>
+            </w:tcBorders>
+          </w:tcPr>
+          <w:p>
+            <w:pPr>
+              <w:spacing w:after="0"/>
+              <w:ind w:left="5" w:right="0" w:firstLine="0"/>
+              <w:rPr>
+                <w:sz w:val="22"/>
+              </w:rPr>
+            </w:pPr>
+            <w:r>
+              <w:rPr>
+                <w:sz w:val="22"/>
+              </w:rPr>
+              <w:t>Содержит сборку, экземпляр товара</w:t>
+            </w:r>
+          </w:p>
+        </w:tc>
+      </w:tr>
+      <w:tr>
+        <w:tblPrEx>
+          <w:tblCellMar>
+            <w:top w:w="120" w:type="dxa"/>
+            <w:right w:w="8" w:type="dxa"/>
+          </w:tblCellMar>
+        </w:tblPrEx>
+        <w:trPr>
+          <w:trHeight w:val="900"/>
+        </w:trPr>
+        <w:tc>
+          <w:tcPr>
+            <w:tcW w:w="860" w:type="dxa"/>
+            <w:tcBorders>
+              <w:top w:val="single" w:sz="8" w:space="0" w:color="000000"/>
+              <w:left w:val="single" w:sz="8" w:space="0" w:color="000000"/>
+              <w:bottom w:val="single" w:sz="8" w:space="0" w:color="000000"/>
+              <w:right w:val="single" w:sz="8" w:space="0" w:color="000000"/>
+            </w:tcBorders>
+          </w:tcPr>
+          <w:p>
+            <w:pPr>
+              <w:spacing w:after="0" w:line="259" w:lineRule="auto"/>
+              <w:ind w:right="55" w:firstLine="0"/>
+              <w:jc w:val="center"/>
+              <w:rPr>
+                <w:sz w:val="22"/>
+              </w:rPr>
+            </w:pPr>
+          </w:p>
+        </w:tc>
+        <w:tc>
+          <w:tcPr>
+            <w:tcW w:w="1760" w:type="dxa"/>
+            <w:tcBorders>
+              <w:top w:val="single" w:sz="8" w:space="0" w:color="000000"/>
+              <w:left w:val="single" w:sz="8" w:space="0" w:color="000000"/>
+              <w:bottom w:val="single" w:sz="8" w:space="0" w:color="000000"/>
+              <w:right w:val="single" w:sz="8" w:space="0" w:color="000000"/>
+            </w:tcBorders>
+          </w:tcPr>
+          <w:p>
+            <w:pPr>
+              <w:spacing w:after="0" w:line="259" w:lineRule="auto"/>
+              <w:ind w:right="0" w:firstLine="0"/>
+              <w:jc w:val="left"/>
+              <w:rPr>
+                <w:sz w:val="22"/>
+              </w:rPr>
+            </w:pPr>
+          </w:p>
+        </w:tc>
+        <w:tc>
+          <w:tcPr>
+            <w:tcW w:w="3980" w:type="dxa"/>
+            <w:tcBorders>
+              <w:top w:val="single" w:sz="8" w:space="0" w:color="000000"/>
+              <w:left w:val="single" w:sz="8" w:space="0" w:color="000000"/>
+              <w:bottom w:val="single" w:sz="8" w:space="0" w:color="000000"/>
+              <w:right w:val="single" w:sz="8" w:space="0" w:color="000000"/>
+            </w:tcBorders>
+          </w:tcPr>
+          <w:p>
+            <w:pPr>
+              <w:spacing w:after="0" w:line="259" w:lineRule="auto"/>
+              <w:ind w:left="10" w:right="56" w:firstLine="0"/>
+              <w:rPr>
+                <w:sz w:val="22"/>
+              </w:rPr>
+            </w:pPr>
+          </w:p>
+        </w:tc>
+        <w:tc>
+          <w:tcPr>
+            <w:tcW w:w="4460" w:type="dxa"/>
+            <w:tcBorders>
+              <w:top w:val="single" w:sz="8" w:space="0" w:color="000000"/>
+              <w:left w:val="single" w:sz="8" w:space="0" w:color="000000"/>
+              <w:bottom w:val="single" w:sz="8" w:space="0" w:color="000000"/>
+              <w:right w:val="single" w:sz="8" w:space="0" w:color="000000"/>
+            </w:tcBorders>
+          </w:tcPr>
+          <w:p>
+            <w:pPr>
+              <w:spacing w:after="0"/>
+              <w:ind w:left="5" w:right="0" w:firstLine="0"/>
+              <w:rPr>
+                <w:sz w:val="22"/>
+              </w:rPr>
+            </w:pPr>
           </w:p>
         </w:tc>
       </w:tr>
@@ -3234,10 +4336,46 @@
       <w:r>
         <w:rPr>
           <w:b/>
+          <w:noProof/>
           <w:color w:val="C00000"/>
           <w:sz w:val="28"/>
         </w:rPr>
-        <w:t>НАДО РЕАЛИЗОВАТЬ</w:t>
+        <w:lastRenderedPageBreak/>
+        <w:drawing>
+          <wp:inline distT="0" distB="0" distL="0" distR="0" wp14:anchorId="2CE8F14D" wp14:editId="62B7364E">
+            <wp:extent cx="7052310" cy="7037070"/>
+            <wp:effectExtent l="0" t="0" r="0" b="0"/>
+            <wp:docPr id="1324520224" name="Рисунок 1"/>
+            <wp:cNvGraphicFramePr>
+              <a:graphicFrameLocks xmlns:a="http://schemas.openxmlformats.org/drawingml/2006/main" noChangeAspect="1"/>
+            </wp:cNvGraphicFramePr>
+            <a:graphic xmlns:a="http://schemas.openxmlformats.org/drawingml/2006/main">
+              <a:graphicData uri="http://schemas.openxmlformats.org/drawingml/2006/picture">
+                <pic:pic xmlns:pic="http://schemas.openxmlformats.org/drawingml/2006/picture">
+                  <pic:nvPicPr>
+                    <pic:cNvPr id="1324520224" name=""/>
+                    <pic:cNvPicPr/>
+                  </pic:nvPicPr>
+                  <pic:blipFill>
+                    <a:blip r:embed="rId5"/>
+                    <a:stretch>
+                      <a:fillRect/>
+                    </a:stretch>
+                  </pic:blipFill>
+                  <pic:spPr>
+                    <a:xfrm>
+                      <a:off x="0" y="0"/>
+                      <a:ext cx="7052310" cy="7037070"/>
+                    </a:xfrm>
+                    <a:prstGeom prst="rect">
+                      <a:avLst/>
+                    </a:prstGeom>
+                  </pic:spPr>
+                </pic:pic>
+              </a:graphicData>
+            </a:graphic>
+          </wp:inline>
+        </w:drawing>
       </w:r>
     </w:p>
     <w:sectPr>
@@ -3996,4 +5134,16 @@
     </a:ext>
   </a:extLst>
 </a:theme>
+</file>
+
+<file path=customXml/item1.xml><?xml version="1.0" encoding="utf-8"?>
+<b:Sources xmlns:b="http://schemas.openxmlformats.org/officeDocument/2006/bibliography" xmlns="http://schemas.openxmlformats.org/officeDocument/2006/bibliography" SelectedStyle="\APASixthEditionOfficeOnline.xsl" StyleName="APA" Version="6"/>
+</file>
+
+<file path=customXml/itemProps1.xml><?xml version="1.0" encoding="utf-8"?>
+<ds:datastoreItem xmlns:ds="http://schemas.openxmlformats.org/officeDocument/2006/customXml" ds:itemID="{2DE1ABB6-7B05-46E7-A334-5BA4B4B6BE55}">
+  <ds:schemaRefs>
+    <ds:schemaRef ds:uri="http://schemas.openxmlformats.org/officeDocument/2006/bibliography"/>
+  </ds:schemaRefs>
+</ds:datastoreItem>
 </file>
</xml_diff>

<commit_message>
reports: get instructor corrections
</commit_message>
<xml_diff>
--- a/reports/1_report.docx
+++ b/reports/1_report.docx
@@ -507,14 +507,14 @@
           <w:b/>
           <w:sz w:val="28"/>
         </w:rPr>
-        <w:t xml:space="preserve">3.1 </w:t>
-      </w:r>
-      <w:r>
-        <w:rPr>
-          <w:b/>
-          <w:sz w:val="28"/>
-        </w:rPr>
-        <w:t>Должен быть создан документ, регламентирующий стандартные единицы измерения той или иной характеристики</w:t>
+        <w:t xml:space="preserve">4 </w:t>
+      </w:r>
+      <w:r>
+        <w:rPr>
+          <w:b/>
+          <w:sz w:val="28"/>
+        </w:rPr>
+        <w:t>Правило совместимости должно содержать ссылки на валидные аргументы</w:t>
       </w:r>
     </w:p>
     <w:p>
@@ -540,14 +540,14 @@
           <w:b/>
           <w:sz w:val="28"/>
         </w:rPr>
-        <w:t xml:space="preserve">4 </w:t>
-      </w:r>
-      <w:r>
-        <w:rPr>
-          <w:b/>
-          <w:sz w:val="28"/>
-        </w:rPr>
-        <w:t>Правило совместимости должно содержать ссылки на валидные аргументы</w:t>
+        <w:t xml:space="preserve">5 </w:t>
+      </w:r>
+      <w:r>
+        <w:rPr>
+          <w:b/>
+          <w:sz w:val="28"/>
+        </w:rPr>
+        <w:t>При изменении правила совместимости, оно «замораживается» и уходит в историю</w:t>
       </w:r>
     </w:p>
     <w:p>
@@ -573,14 +573,14 @@
           <w:b/>
           <w:sz w:val="28"/>
         </w:rPr>
-        <w:t xml:space="preserve">5 </w:t>
-      </w:r>
-      <w:r>
-        <w:rPr>
-          <w:b/>
-          <w:sz w:val="28"/>
-        </w:rPr>
-        <w:t>При изменении правила совместимости, оно «замораживается» и уходит в историю. Для проверки следует проверить дату отказа</w:t>
+        <w:t xml:space="preserve">6 </w:t>
+      </w:r>
+      <w:r>
+        <w:rPr>
+          <w:b/>
+          <w:sz w:val="28"/>
+        </w:rPr>
+        <w:t>При сборке нового компьютера, система обязана проходить по всем правилам совместимости для определения валидности сборки</w:t>
       </w:r>
     </w:p>
     <w:p>
@@ -606,14 +606,14 @@
           <w:b/>
           <w:sz w:val="28"/>
         </w:rPr>
-        <w:t xml:space="preserve">6 </w:t>
-      </w:r>
-      <w:r>
-        <w:rPr>
-          <w:b/>
-          <w:sz w:val="28"/>
-        </w:rPr>
-        <w:t>При сборке нового компьютера, система обязана проходить по всем правилам совместимости для определения валидности сборки</w:t>
+        <w:t xml:space="preserve">7 </w:t>
+      </w:r>
+      <w:r>
+        <w:rPr>
+          <w:b/>
+          <w:sz w:val="28"/>
+        </w:rPr>
+        <w:t>При нарушении обязательных условий сборку компьютера может одобрить лишь технический специалист</w:t>
       </w:r>
     </w:p>
     <w:p>
@@ -639,14 +639,14 @@
           <w:b/>
           <w:sz w:val="28"/>
         </w:rPr>
-        <w:t xml:space="preserve">7 </w:t>
-      </w:r>
-      <w:r>
-        <w:rPr>
-          <w:b/>
-          <w:sz w:val="28"/>
-        </w:rPr>
-        <w:t>При нарушении обязательных условий сборку компьютера может одобрить лишь технический специалист</w:t>
+        <w:t xml:space="preserve">8 </w:t>
+      </w:r>
+      <w:r>
+        <w:rPr>
+          <w:b/>
+          <w:sz w:val="28"/>
+        </w:rPr>
+        <w:t>Учет отдельной комплектующей ведется благодаря ее серийному номеру</w:t>
       </w:r>
     </w:p>
     <w:p>
@@ -672,14 +672,7 @@
           <w:b/>
           <w:sz w:val="28"/>
         </w:rPr>
-        <w:t xml:space="preserve">8 </w:t>
-      </w:r>
-      <w:r>
-        <w:rPr>
-          <w:b/>
-          <w:sz w:val="28"/>
-        </w:rPr>
-        <w:t>Учет отдельной комплектующей ведется благодаря ее серийному номеру</w:t>
+        <w:t>8.1 Серийный номер комплектующей должен быть уникален</w:t>
       </w:r>
     </w:p>
     <w:p>
@@ -705,7 +698,14 @@
           <w:b/>
           <w:sz w:val="28"/>
         </w:rPr>
-        <w:t>8.1 Серийный номер комплектующей должен быть уникален</w:t>
+        <w:t xml:space="preserve">9 </w:t>
+      </w:r>
+      <w:r>
+        <w:rPr>
+          <w:b/>
+          <w:sz w:val="28"/>
+        </w:rPr>
+        <w:t>Любой экземпляр комплектующей привязан к той или иной партии</w:t>
       </w:r>
     </w:p>
     <w:p>
@@ -731,14 +731,14 @@
           <w:b/>
           <w:sz w:val="28"/>
         </w:rPr>
-        <w:t xml:space="preserve">9 </w:t>
-      </w:r>
-      <w:r>
-        <w:rPr>
-          <w:b/>
-          <w:sz w:val="28"/>
-        </w:rPr>
-        <w:t>Любой экземпляр комплектующей привязан к той или иной партии</w:t>
+        <w:t xml:space="preserve">10 </w:t>
+      </w:r>
+      <w:r>
+        <w:rPr>
+          <w:b/>
+          <w:sz w:val="28"/>
+        </w:rPr>
+        <w:t>Экземпляр комплектующей / сборка не может находиться одновременно в двух взаимоисключающих состояниях</w:t>
       </w:r>
     </w:p>
     <w:p>
@@ -764,14 +764,14 @@
           <w:b/>
           <w:sz w:val="28"/>
         </w:rPr>
-        <w:t xml:space="preserve">10 </w:t>
-      </w:r>
-      <w:r>
-        <w:rPr>
-          <w:b/>
-          <w:sz w:val="28"/>
-        </w:rPr>
-        <w:t>Экземпляр комплектующей / сборка не может находиться одновременно в двух взаимоисключающих состояниях</w:t>
+        <w:t xml:space="preserve">11 </w:t>
+      </w:r>
+      <w:r>
+        <w:rPr>
+          <w:b/>
+          <w:sz w:val="28"/>
+        </w:rPr>
+        <w:t>Перед началом сборки необходимо зарезервировать нужные экземпляры комплектующих</w:t>
       </w:r>
     </w:p>
     <w:p>
@@ -797,14 +797,14 @@
           <w:b/>
           <w:sz w:val="28"/>
         </w:rPr>
-        <w:t xml:space="preserve">11 </w:t>
-      </w:r>
-      <w:r>
-        <w:rPr>
-          <w:b/>
-          <w:sz w:val="28"/>
-        </w:rPr>
-        <w:t>Перед началом сборки необходимо зарезервировать нужные экземпляры комплектующих</w:t>
+        <w:t xml:space="preserve">12 </w:t>
+      </w:r>
+      <w:r>
+        <w:rPr>
+          <w:b/>
+          <w:sz w:val="28"/>
+        </w:rPr>
+        <w:t>Резерв экземпляра имеет срок действия. По его истечении резерв снимается</w:t>
       </w:r>
     </w:p>
     <w:p>
@@ -830,14 +830,14 @@
           <w:b/>
           <w:sz w:val="28"/>
         </w:rPr>
-        <w:t xml:space="preserve">12 </w:t>
-      </w:r>
-      <w:r>
-        <w:rPr>
-          <w:b/>
-          <w:sz w:val="28"/>
-        </w:rPr>
-        <w:t>Резерв экземпляра имеет срок действия. По его истечении резерв снимается</w:t>
+        <w:t xml:space="preserve">13 </w:t>
+      </w:r>
+      <w:r>
+        <w:rPr>
+          <w:b/>
+          <w:sz w:val="28"/>
+        </w:rPr>
+        <w:t>Сборка должна знать, какие именно экземпляры компонентов в ней установлены</w:t>
       </w:r>
     </w:p>
     <w:p>
@@ -863,14 +863,14 @@
           <w:b/>
           <w:sz w:val="28"/>
         </w:rPr>
-        <w:t xml:space="preserve">13 </w:t>
-      </w:r>
-      <w:r>
-        <w:rPr>
-          <w:b/>
-          <w:sz w:val="28"/>
-        </w:rPr>
-        <w:t>Сборка должна знать, какие именно экземпляры компонентов в ней установлены</w:t>
+        <w:t xml:space="preserve">14 </w:t>
+      </w:r>
+      <w:r>
+        <w:rPr>
+          <w:b/>
+          <w:sz w:val="28"/>
+        </w:rPr>
+        <w:t>После сборки компьютера он должен пройти обязательное тестирование</w:t>
       </w:r>
     </w:p>
     <w:p>
@@ -896,14 +896,47 @@
           <w:b/>
           <w:sz w:val="28"/>
         </w:rPr>
-        <w:t xml:space="preserve">14 </w:t>
-      </w:r>
-      <w:r>
-        <w:rPr>
-          <w:b/>
-          <w:sz w:val="28"/>
-        </w:rPr>
-        <w:t>После сборки компьютера он должен пройти обязательное тестирование</w:t>
+        <w:t xml:space="preserve">15 </w:t>
+      </w:r>
+      <w:r>
+        <w:rPr>
+          <w:b/>
+          <w:sz w:val="28"/>
+        </w:rPr>
+        <w:t>Продажа сборки должна быть привязана к сущности заказа клиента</w:t>
+      </w:r>
+    </w:p>
+    <w:p>
+      <w:pPr>
+        <w:spacing w:after="0" w:line="259" w:lineRule="auto"/>
+        <w:ind w:right="0" w:firstLine="0"/>
+        <w:jc w:val="left"/>
+        <w:rPr>
+          <w:b/>
+          <w:sz w:val="28"/>
+        </w:rPr>
+      </w:pPr>
+      <w:r>
+        <w:rPr>
+          <w:b/>
+          <w:sz w:val="28"/>
+          <w:lang w:val="en-US"/>
+        </w:rPr>
+        <w:t>R</w:t>
+      </w:r>
+      <w:r>
+        <w:rPr>
+          <w:b/>
+          <w:sz w:val="28"/>
+        </w:rPr>
+        <w:t xml:space="preserve">16 </w:t>
+      </w:r>
+      <w:r>
+        <w:rPr>
+          <w:b/>
+          <w:sz w:val="28"/>
+        </w:rPr>
+        <w:t>При продажи сборки должны быть сообщены все серийные номера</w:t>
       </w:r>
     </w:p>
     <w:p>
@@ -930,14 +963,14 @@
           <w:b/>
           <w:sz w:val="28"/>
         </w:rPr>
-        <w:t xml:space="preserve">15 </w:t>
-      </w:r>
-      <w:r>
-        <w:rPr>
-          <w:b/>
-          <w:sz w:val="28"/>
-        </w:rPr>
-        <w:t>Продажа сборки должна быть привязана к сущности заказа клиента</w:t>
+        <w:t xml:space="preserve">17 </w:t>
+      </w:r>
+      <w:r>
+        <w:rPr>
+          <w:b/>
+          <w:sz w:val="28"/>
+        </w:rPr>
+        <w:t>Некоторая сборка или некоторый экземпляр комплектующей может быть продан лишь один раз</w:t>
       </w:r>
     </w:p>
     <w:p>
@@ -963,72 +996,6 @@
           <w:b/>
           <w:sz w:val="28"/>
         </w:rPr>
-        <w:t xml:space="preserve">16 </w:t>
-      </w:r>
-      <w:r>
-        <w:rPr>
-          <w:b/>
-          <w:sz w:val="28"/>
-        </w:rPr>
-        <w:t>При продажи сборки должны быть сообщены все серийные номера</w:t>
-      </w:r>
-    </w:p>
-    <w:p>
-      <w:pPr>
-        <w:spacing w:after="0" w:line="259" w:lineRule="auto"/>
-        <w:ind w:right="0" w:firstLine="0"/>
-        <w:jc w:val="left"/>
-        <w:rPr>
-          <w:b/>
-          <w:sz w:val="28"/>
-        </w:rPr>
-      </w:pPr>
-      <w:r>
-        <w:rPr>
-          <w:b/>
-          <w:sz w:val="28"/>
-          <w:lang w:val="en-US"/>
-        </w:rPr>
-        <w:t>R</w:t>
-      </w:r>
-      <w:r>
-        <w:rPr>
-          <w:b/>
-          <w:sz w:val="28"/>
-        </w:rPr>
-        <w:t xml:space="preserve">17 </w:t>
-      </w:r>
-      <w:r>
-        <w:rPr>
-          <w:b/>
-          <w:sz w:val="28"/>
-        </w:rPr>
-        <w:t>Некоторая сборка или некоторый экземпляр комплектующей может быть продан лишь один раз</w:t>
-      </w:r>
-    </w:p>
-    <w:p>
-      <w:pPr>
-        <w:spacing w:after="0" w:line="259" w:lineRule="auto"/>
-        <w:ind w:right="0" w:firstLine="0"/>
-        <w:jc w:val="left"/>
-        <w:rPr>
-          <w:b/>
-          <w:sz w:val="28"/>
-        </w:rPr>
-      </w:pPr>
-      <w:r>
-        <w:rPr>
-          <w:b/>
-          <w:sz w:val="28"/>
-          <w:lang w:val="en-US"/>
-        </w:rPr>
-        <w:t>R</w:t>
-      </w:r>
-      <w:r>
-        <w:rPr>
-          <w:b/>
-          <w:sz w:val="28"/>
-        </w:rPr>
         <w:t xml:space="preserve">18 </w:t>
       </w:r>
       <w:r>
@@ -1038,6 +1005,28 @@
         </w:rPr>
         <w:t>Гарантийное обращение должно иметь основание</w:t>
       </w:r>
+    </w:p>
+    <w:p>
+      <w:pPr>
+        <w:spacing w:after="0" w:line="259" w:lineRule="auto"/>
+        <w:ind w:right="0" w:firstLine="0"/>
+        <w:jc w:val="left"/>
+        <w:rPr>
+          <w:b/>
+          <w:sz w:val="28"/>
+        </w:rPr>
+      </w:pPr>
+    </w:p>
+    <w:p>
+      <w:pPr>
+        <w:spacing w:after="0" w:line="259" w:lineRule="auto"/>
+        <w:ind w:right="0" w:firstLine="0"/>
+        <w:jc w:val="left"/>
+        <w:rPr>
+          <w:b/>
+          <w:sz w:val="28"/>
+        </w:rPr>
+      </w:pPr>
     </w:p>
     <w:p>
       <w:pPr>
@@ -1465,33 +1454,13 @@
               <w:rPr>
                 <w:sz w:val="22"/>
               </w:rPr>
-              <w:t xml:space="preserve"> </w:t>
-            </w:r>
-            <w:proofErr w:type="gramStart"/>
-            <w:r>
-              <w:rPr>
-                <w:sz w:val="22"/>
-              </w:rPr>
-              <w:t>комплектующей</w:t>
-            </w:r>
-            <w:r>
-              <w:rPr>
-                <w:sz w:val="22"/>
-              </w:rPr>
-              <w:t xml:space="preserve"> </w:t>
-            </w:r>
-            <w:r>
-              <w:rPr>
-                <w:sz w:val="22"/>
-              </w:rPr>
-              <w:t>,</w:t>
-            </w:r>
-            <w:proofErr w:type="gramEnd"/>
-            <w:r>
-              <w:rPr>
-                <w:sz w:val="22"/>
-              </w:rPr>
-              <w:t xml:space="preserve"> </w:t>
+              <w:t xml:space="preserve"> комплектующей</w:t>
+            </w:r>
+            <w:r>
+              <w:rPr>
+                <w:sz w:val="22"/>
+              </w:rPr>
+              <w:t xml:space="preserve">, </w:t>
             </w:r>
             <w:r>
               <w:rPr>
@@ -1595,6 +1564,12 @@
               </w:rPr>
               <w:t>родительская категория</w:t>
             </w:r>
+            <w:r>
+              <w:rPr>
+                <w:sz w:val="22"/>
+              </w:rPr>
+              <w:t xml:space="preserve"> при наличии</w:t>
+            </w:r>
           </w:p>
         </w:tc>
       </w:tr>
@@ -1825,18 +1800,10 @@
             </w:r>
             <w:r>
               <w:rPr>
-                <w:strike/>
-                <w:color w:val="C00000"/>
-                <w:sz w:val="22"/>
-              </w:rPr>
-              <w:t>единица измерения</w:t>
-            </w:r>
-            <w:r>
-              <w:rPr>
-                <w:color w:val="C00000"/>
-                <w:sz w:val="22"/>
-              </w:rPr>
-              <w:t xml:space="preserve"> </w:t>
+                <w:color w:val="000000" w:themeColor="text1"/>
+                <w:sz w:val="22"/>
+              </w:rPr>
+              <w:t xml:space="preserve">единица измерения </w:t>
             </w:r>
           </w:p>
         </w:tc>
@@ -2639,25 +2606,13 @@
               <w:rPr>
                 <w:sz w:val="22"/>
               </w:rPr>
-              <w:t xml:space="preserve">модель </w:t>
-            </w:r>
-            <w:r>
-              <w:rPr>
-                <w:sz w:val="22"/>
-              </w:rPr>
-              <w:t>комплектующ</w:t>
-            </w:r>
-            <w:r>
-              <w:rPr>
-                <w:sz w:val="22"/>
-              </w:rPr>
-              <w:t>ей</w:t>
-            </w:r>
-            <w:r>
-              <w:rPr>
-                <w:sz w:val="22"/>
-              </w:rPr>
-              <w:t>, дат</w:t>
+              <w:t>д</w:t>
+            </w:r>
+            <w:r>
+              <w:rPr>
+                <w:sz w:val="22"/>
+              </w:rPr>
+              <w:t>ат</w:t>
             </w:r>
             <w:r>
               <w:rPr>
@@ -2937,34 +2892,13 @@
                 <w:color w:val="806000" w:themeColor="accent4" w:themeShade="80"/>
                 <w:sz w:val="22"/>
               </w:rPr>
-              <w:t xml:space="preserve">перечень </w:t>
-            </w:r>
-            <w:proofErr w:type="gramStart"/>
-            <w:r>
-              <w:rPr>
-                <w:color w:val="806000" w:themeColor="accent4" w:themeShade="80"/>
-                <w:sz w:val="22"/>
-              </w:rPr>
-              <w:t>комплектующих</w:t>
-            </w:r>
-            <w:r>
-              <w:rPr>
-                <w:sz w:val="22"/>
-              </w:rPr>
-              <w:t xml:space="preserve"> </w:t>
-            </w:r>
-            <w:r>
-              <w:rPr>
-                <w:sz w:val="22"/>
-              </w:rPr>
-              <w:t>,</w:t>
-            </w:r>
-            <w:proofErr w:type="gramEnd"/>
-            <w:r>
-              <w:rPr>
-                <w:sz w:val="22"/>
-              </w:rPr>
-              <w:t xml:space="preserve"> статус</w:t>
+              <w:t>перечень комплектующих</w:t>
+            </w:r>
+            <w:r>
+              <w:rPr>
+                <w:sz w:val="22"/>
+              </w:rPr>
+              <w:t>, статус</w:t>
             </w:r>
             <w:r>
               <w:rPr>
@@ -3418,14 +3352,7 @@
               <w:rPr>
                 <w:sz w:val="22"/>
               </w:rPr>
-              <w:t xml:space="preserve">я </w:t>
-            </w:r>
-            <w:proofErr w:type="gramStart"/>
-            <w:r>
-              <w:rPr>
-                <w:sz w:val="22"/>
-              </w:rPr>
-              <w:t>сборки</w:t>
+              <w:t>я сборки</w:t>
             </w:r>
             <w:r>
               <w:rPr>
@@ -3443,14 +3370,7 @@
               <w:rPr>
                 <w:sz w:val="22"/>
               </w:rPr>
-              <w:t xml:space="preserve"> дата</w:t>
-            </w:r>
-            <w:proofErr w:type="gramEnd"/>
-            <w:r>
-              <w:rPr>
-                <w:sz w:val="22"/>
-              </w:rPr>
-              <w:t xml:space="preserve"> и время </w:t>
+              <w:t xml:space="preserve"> дата и время </w:t>
             </w:r>
             <w:r>
               <w:rPr>
@@ -4072,12 +3992,6 @@
                 <w:sz w:val="22"/>
               </w:rPr>
             </w:pPr>
-            <w:r>
-              <w:rPr>
-                <w:sz w:val="22"/>
-              </w:rPr>
-              <w:t>Е19</w:t>
-            </w:r>
           </w:p>
         </w:tc>
         <w:tc>
@@ -4099,12 +4013,6 @@
                 <w:sz w:val="22"/>
               </w:rPr>
             </w:pPr>
-            <w:r>
-              <w:rPr>
-                <w:sz w:val="22"/>
-              </w:rPr>
-              <w:t>Установленная комплектующая</w:t>
-            </w:r>
           </w:p>
         </w:tc>
         <w:tc>
@@ -4125,12 +4033,6 @@
                 <w:sz w:val="22"/>
               </w:rPr>
             </w:pPr>
-            <w:r>
-              <w:rPr>
-                <w:sz w:val="22"/>
-              </w:rPr>
-              <w:t>Определенный экземпляр, установленный в некоторую сборку</w:t>
-            </w:r>
           </w:p>
         </w:tc>
         <w:tc>
@@ -4151,105 +4053,6 @@
                 <w:sz w:val="22"/>
               </w:rPr>
             </w:pPr>
-            <w:r>
-              <w:rPr>
-                <w:sz w:val="22"/>
-              </w:rPr>
-              <w:t>Содержит сборку, экземпляр товара</w:t>
-            </w:r>
-          </w:p>
-        </w:tc>
-      </w:tr>
-      <w:tr>
-        <w:tblPrEx>
-          <w:tblCellMar>
-            <w:top w:w="120" w:type="dxa"/>
-            <w:right w:w="8" w:type="dxa"/>
-          </w:tblCellMar>
-        </w:tblPrEx>
-        <w:trPr>
-          <w:trHeight w:val="900"/>
-        </w:trPr>
-        <w:tc>
-          <w:tcPr>
-            <w:tcW w:w="860" w:type="dxa"/>
-            <w:tcBorders>
-              <w:top w:val="single" w:sz="8" w:space="0" w:color="000000"/>
-              <w:left w:val="single" w:sz="8" w:space="0" w:color="000000"/>
-              <w:bottom w:val="single" w:sz="8" w:space="0" w:color="000000"/>
-              <w:right w:val="single" w:sz="8" w:space="0" w:color="000000"/>
-            </w:tcBorders>
-          </w:tcPr>
-          <w:p>
-            <w:pPr>
-              <w:spacing w:after="0" w:line="259" w:lineRule="auto"/>
-              <w:ind w:right="55" w:firstLine="0"/>
-              <w:jc w:val="center"/>
-              <w:rPr>
-                <w:sz w:val="22"/>
-              </w:rPr>
-            </w:pPr>
-          </w:p>
-        </w:tc>
-        <w:tc>
-          <w:tcPr>
-            <w:tcW w:w="1760" w:type="dxa"/>
-            <w:tcBorders>
-              <w:top w:val="single" w:sz="8" w:space="0" w:color="000000"/>
-              <w:left w:val="single" w:sz="8" w:space="0" w:color="000000"/>
-              <w:bottom w:val="single" w:sz="8" w:space="0" w:color="000000"/>
-              <w:right w:val="single" w:sz="8" w:space="0" w:color="000000"/>
-            </w:tcBorders>
-          </w:tcPr>
-          <w:p>
-            <w:pPr>
-              <w:spacing w:after="0" w:line="259" w:lineRule="auto"/>
-              <w:ind w:right="0" w:firstLine="0"/>
-              <w:jc w:val="left"/>
-              <w:rPr>
-                <w:sz w:val="22"/>
-              </w:rPr>
-            </w:pPr>
-          </w:p>
-        </w:tc>
-        <w:tc>
-          <w:tcPr>
-            <w:tcW w:w="3980" w:type="dxa"/>
-            <w:tcBorders>
-              <w:top w:val="single" w:sz="8" w:space="0" w:color="000000"/>
-              <w:left w:val="single" w:sz="8" w:space="0" w:color="000000"/>
-              <w:bottom w:val="single" w:sz="8" w:space="0" w:color="000000"/>
-              <w:right w:val="single" w:sz="8" w:space="0" w:color="000000"/>
-            </w:tcBorders>
-          </w:tcPr>
-          <w:p>
-            <w:pPr>
-              <w:spacing w:after="0" w:line="259" w:lineRule="auto"/>
-              <w:ind w:left="10" w:right="56" w:firstLine="0"/>
-              <w:rPr>
-                <w:sz w:val="22"/>
-              </w:rPr>
-            </w:pPr>
-          </w:p>
-        </w:tc>
-        <w:tc>
-          <w:tcPr>
-            <w:tcW w:w="4460" w:type="dxa"/>
-            <w:tcBorders>
-              <w:top w:val="single" w:sz="8" w:space="0" w:color="000000"/>
-              <w:left w:val="single" w:sz="8" w:space="0" w:color="000000"/>
-              <w:bottom w:val="single" w:sz="8" w:space="0" w:color="000000"/>
-              <w:right w:val="single" w:sz="8" w:space="0" w:color="000000"/>
-            </w:tcBorders>
-          </w:tcPr>
-          <w:p>
-            <w:pPr>
-              <w:spacing w:after="0"/>
-              <w:ind w:left="5" w:right="0" w:firstLine="0"/>
-              <w:rPr>
-                <w:sz w:val="22"/>
-              </w:rPr>
-            </w:pPr>
           </w:p>
         </w:tc>
       </w:tr>
@@ -4260,12 +4063,6 @@
         <w:ind w:right="0" w:firstLine="0"/>
         <w:jc w:val="left"/>
       </w:pPr>
-      <w:r>
-        <w:rPr>
-          <w:sz w:val="22"/>
-        </w:rPr>
-        <w:t xml:space="preserve">  </w:t>
-      </w:r>
     </w:p>
     <w:p>
       <w:pPr>
@@ -4377,6 +4174,270 @@
           </wp:inline>
         </w:drawing>
       </w:r>
+    </w:p>
+    <w:p>
+      <w:pPr>
+        <w:spacing w:after="0" w:line="259" w:lineRule="auto"/>
+        <w:ind w:right="0" w:firstLine="0"/>
+        <w:jc w:val="left"/>
+        <w:rPr>
+          <w:b/>
+          <w:color w:val="C00000"/>
+          <w:sz w:val="28"/>
+        </w:rPr>
+      </w:pPr>
+    </w:p>
+    <w:p>
+      <w:pPr>
+        <w:spacing w:after="0" w:line="259" w:lineRule="auto"/>
+        <w:ind w:right="0" w:firstLine="0"/>
+        <w:jc w:val="left"/>
+        <w:rPr>
+          <w:b/>
+          <w:color w:val="C00000"/>
+          <w:sz w:val="28"/>
+        </w:rPr>
+      </w:pPr>
+    </w:p>
+    <w:p>
+      <w:pPr>
+        <w:spacing w:after="0" w:line="259" w:lineRule="auto"/>
+        <w:ind w:right="0" w:firstLine="0"/>
+        <w:jc w:val="left"/>
+        <w:rPr>
+          <w:b/>
+          <w:color w:val="C00000"/>
+          <w:sz w:val="28"/>
+        </w:rPr>
+      </w:pPr>
+      <w:r>
+        <w:rPr>
+          <w:b/>
+          <w:color w:val="C00000"/>
+          <w:sz w:val="28"/>
+        </w:rPr>
+        <w:t>ДОЛЖНО БЫТЬ ЗЕРКАЛЬНЫМ</w:t>
+      </w:r>
+      <w:r>
+        <w:rPr>
+          <w:b/>
+          <w:color w:val="C00000"/>
+          <w:sz w:val="28"/>
+        </w:rPr>
+        <w:t xml:space="preserve"> ОТНОСИТЕЛЬНО ГЛАВНОЙ ДИАГОНАЛИ</w:t>
+      </w:r>
+    </w:p>
+    <w:p>
+      <w:pPr>
+        <w:spacing w:after="0" w:line="259" w:lineRule="auto"/>
+        <w:ind w:right="0" w:firstLine="0"/>
+        <w:jc w:val="left"/>
+        <w:rPr>
+          <w:b/>
+          <w:color w:val="C00000"/>
+          <w:sz w:val="28"/>
+        </w:rPr>
+      </w:pPr>
+    </w:p>
+    <w:p>
+      <w:pPr>
+        <w:spacing w:after="0" w:line="259" w:lineRule="auto"/>
+        <w:ind w:right="0" w:firstLine="0"/>
+        <w:jc w:val="left"/>
+        <w:rPr>
+          <w:b/>
+          <w:color w:val="C00000"/>
+          <w:sz w:val="28"/>
+          <w:lang w:val="en-US"/>
+        </w:rPr>
+      </w:pPr>
+      <w:r>
+        <w:rPr>
+          <w:b/>
+          <w:color w:val="C00000"/>
+          <w:sz w:val="28"/>
+          <w:lang w:val="en-US"/>
+        </w:rPr>
+        <w:t xml:space="preserve">E1 E8 MJUST BE </w:t>
+      </w:r>
+      <w:r>
+        <w:rPr>
+          <w:b/>
+          <w:color w:val="C00000"/>
+          <w:sz w:val="28"/>
+          <w:lang w:val="en-US"/>
+        </w:rPr>
+        <w:t>N:N</w:t>
+      </w:r>
+    </w:p>
+    <w:p>
+      <w:pPr>
+        <w:spacing w:after="0" w:line="259" w:lineRule="auto"/>
+        <w:ind w:right="0" w:firstLine="0"/>
+        <w:jc w:val="left"/>
+        <w:rPr>
+          <w:b/>
+          <w:color w:val="C00000"/>
+          <w:sz w:val="28"/>
+          <w:lang w:val="en-US"/>
+        </w:rPr>
+      </w:pPr>
+      <w:r>
+        <w:rPr>
+          <w:b/>
+          <w:color w:val="C00000"/>
+          <w:sz w:val="28"/>
+          <w:lang w:val="en-US"/>
+        </w:rPr>
+        <w:t>E8 E1 delete transition</w:t>
+      </w:r>
+    </w:p>
+    <w:p>
+      <w:pPr>
+        <w:spacing w:after="0" w:line="259" w:lineRule="auto"/>
+        <w:ind w:right="0" w:firstLine="0"/>
+        <w:jc w:val="left"/>
+        <w:rPr>
+          <w:b/>
+          <w:color w:val="C00000"/>
+          <w:sz w:val="28"/>
+          <w:lang w:val="en-US"/>
+        </w:rPr>
+      </w:pPr>
+      <w:r>
+        <w:rPr>
+          <w:b/>
+          <w:color w:val="C00000"/>
+          <w:sz w:val="28"/>
+          <w:lang w:val="en-US"/>
+        </w:rPr>
+        <w:t>E10 E11 must be n:1</w:t>
+      </w:r>
+    </w:p>
+    <w:p>
+      <w:pPr>
+        <w:spacing w:after="0" w:line="259" w:lineRule="auto"/>
+        <w:ind w:right="0" w:firstLine="0"/>
+        <w:jc w:val="left"/>
+        <w:rPr>
+          <w:b/>
+          <w:color w:val="C00000"/>
+          <w:sz w:val="28"/>
+        </w:rPr>
+      </w:pPr>
+      <w:r>
+        <w:rPr>
+          <w:b/>
+          <w:color w:val="C00000"/>
+          <w:sz w:val="28"/>
+          <w:lang w:val="en-US"/>
+        </w:rPr>
+        <w:t>E18 e9 must be 1:N</w:t>
+      </w:r>
+    </w:p>
+    <w:p>
+      <w:pPr>
+        <w:spacing w:after="0" w:line="259" w:lineRule="auto"/>
+        <w:ind w:right="0" w:firstLine="0"/>
+        <w:jc w:val="left"/>
+        <w:rPr>
+          <w:b/>
+          <w:color w:val="C00000"/>
+          <w:sz w:val="28"/>
+          <w:lang w:val="en-US"/>
+        </w:rPr>
+      </w:pPr>
+      <w:r>
+        <w:rPr>
+          <w:b/>
+          <w:color w:val="C00000"/>
+          <w:sz w:val="28"/>
+          <w:lang w:val="en-US"/>
+        </w:rPr>
+        <w:t>E17 e14 must be 1:N</w:t>
+      </w:r>
+    </w:p>
+    <w:p>
+      <w:pPr>
+        <w:spacing w:after="0" w:line="259" w:lineRule="auto"/>
+        <w:ind w:right="0" w:firstLine="0"/>
+        <w:jc w:val="left"/>
+        <w:rPr>
+          <w:b/>
+          <w:color w:val="C00000"/>
+          <w:sz w:val="28"/>
+        </w:rPr>
+      </w:pPr>
+      <w:r>
+        <w:rPr>
+          <w:b/>
+          <w:color w:val="C00000"/>
+          <w:sz w:val="28"/>
+          <w:lang w:val="en-US"/>
+        </w:rPr>
+        <w:t>E</w:t>
+      </w:r>
+      <w:r>
+        <w:rPr>
+          <w:b/>
+          <w:color w:val="C00000"/>
+          <w:sz w:val="28"/>
+        </w:rPr>
+        <w:t xml:space="preserve">18 </w:t>
+      </w:r>
+      <w:r>
+        <w:rPr>
+          <w:b/>
+          <w:color w:val="C00000"/>
+          <w:sz w:val="28"/>
+          <w:lang w:val="en-US"/>
+        </w:rPr>
+        <w:t>E17 must be 1:N</w:t>
+      </w:r>
+    </w:p>
+    <w:p>
+      <w:pPr>
+        <w:spacing w:after="0" w:line="259" w:lineRule="auto"/>
+        <w:ind w:right="0" w:firstLine="0"/>
+        <w:jc w:val="left"/>
+        <w:rPr>
+          <w:b/>
+          <w:color w:val="C00000"/>
+          <w:sz w:val="28"/>
+        </w:rPr>
+      </w:pPr>
+      <w:r>
+        <w:rPr>
+          <w:b/>
+          <w:color w:val="C00000"/>
+          <w:sz w:val="28"/>
+        </w:rPr>
+        <w:t>Переделать е15 как интерфейс над множеством результатов отдельных тестов е16</w:t>
+      </w:r>
+    </w:p>
+    <w:p>
+      <w:pPr>
+        <w:spacing w:after="0" w:line="259" w:lineRule="auto"/>
+        <w:ind w:right="0" w:firstLine="0"/>
+        <w:jc w:val="left"/>
+        <w:rPr>
+          <w:b/>
+          <w:color w:val="C00000"/>
+          <w:sz w:val="28"/>
+        </w:rPr>
+      </w:pPr>
+    </w:p>
+    <w:p>
+      <w:pPr>
+        <w:spacing w:after="0" w:line="259" w:lineRule="auto"/>
+        <w:ind w:right="0" w:firstLine="0"/>
+        <w:jc w:val="left"/>
+        <w:rPr>
+          <w:b/>
+          <w:color w:val="C00000"/>
+          <w:sz w:val="28"/>
+        </w:rPr>
+      </w:pPr>
     </w:p>
     <w:sectPr>
       <w:pgSz w:w="12240" w:h="15840"/>

</xml_diff>

<commit_message>
reports: fix 1_report per instructor feedback
</commit_message>
<xml_diff>
--- a/reports/1_report.docx
+++ b/reports/1_report.docx
@@ -1356,7 +1356,31 @@
               <w:rPr>
                 <w:sz w:val="22"/>
               </w:rPr>
-              <w:t xml:space="preserve">статус </w:t>
+              <w:t>статус</w:t>
+            </w:r>
+            <w:r>
+              <w:rPr>
+                <w:sz w:val="22"/>
+              </w:rPr>
+              <w:t>,</w:t>
+            </w:r>
+            <w:r>
+              <w:rPr>
+                <w:sz w:val="22"/>
+              </w:rPr>
+              <w:t xml:space="preserve"> </w:t>
+            </w:r>
+            <w:r>
+              <w:rPr>
+                <w:sz w:val="22"/>
+              </w:rPr>
+              <w:t>срок гарантии</w:t>
+            </w:r>
+            <w:r>
+              <w:rPr>
+                <w:sz w:val="22"/>
+              </w:rPr>
+              <w:t xml:space="preserve"> </w:t>
             </w:r>
           </w:p>
         </w:tc>
@@ -1950,7 +1974,14 @@
                 <w:color w:val="806000" w:themeColor="accent4" w:themeShade="80"/>
                 <w:sz w:val="22"/>
               </w:rPr>
-              <w:t xml:space="preserve">тип, </w:t>
+              <w:t>категория комплектующей</w:t>
+            </w:r>
+            <w:r>
+              <w:rPr>
+                <w:color w:val="806000" w:themeColor="accent4" w:themeShade="80"/>
+                <w:sz w:val="22"/>
+              </w:rPr>
+              <w:t xml:space="preserve">, </w:t>
             </w:r>
             <w:r>
               <w:rPr>
@@ -2339,7 +2370,19 @@
               <w:rPr>
                 <w:sz w:val="22"/>
               </w:rPr>
-              <w:t xml:space="preserve">Партия товара </w:t>
+              <w:t xml:space="preserve">Партия </w:t>
+            </w:r>
+            <w:r>
+              <w:rPr>
+                <w:sz w:val="22"/>
+              </w:rPr>
+              <w:t>комплектующих</w:t>
+            </w:r>
+            <w:r>
+              <w:rPr>
+                <w:sz w:val="22"/>
+              </w:rPr>
+              <w:t xml:space="preserve"> </w:t>
             </w:r>
           </w:p>
         </w:tc>
@@ -2624,7 +2667,13 @@
               <w:rPr>
                 <w:sz w:val="22"/>
               </w:rPr>
-              <w:t xml:space="preserve"> поступления, текущее местонахождение, статус </w:t>
+              <w:t xml:space="preserve"> поступления, текущее местонахождение, статус</w:t>
+            </w:r>
+            <w:r>
+              <w:rPr>
+                <w:sz w:val="22"/>
+              </w:rPr>
+              <w:t>, партия комплектующих</w:t>
             </w:r>
           </w:p>
         </w:tc>
@@ -2735,6 +2784,12 @@
               <w:rPr>
                 <w:sz w:val="22"/>
               </w:rPr>
+              <w:t xml:space="preserve">контактные данные, </w:t>
+            </w:r>
+            <w:r>
+              <w:rPr>
+                <w:sz w:val="22"/>
+              </w:rPr>
               <w:t>конфигурацию сборки</w:t>
             </w:r>
             <w:r>
@@ -2879,13 +2934,25 @@
               <w:rPr>
                 <w:sz w:val="22"/>
               </w:rPr>
-              <w:t>номер сборки</w:t>
-            </w:r>
-            <w:r>
-              <w:rPr>
-                <w:sz w:val="22"/>
-              </w:rPr>
-              <w:t xml:space="preserve">, </w:t>
+              <w:t>номер</w:t>
+            </w:r>
+            <w:r>
+              <w:rPr>
+                <w:sz w:val="22"/>
+              </w:rPr>
+              <w:t>,</w:t>
+            </w:r>
+            <w:r>
+              <w:rPr>
+                <w:sz w:val="22"/>
+              </w:rPr>
+              <w:t xml:space="preserve"> </w:t>
+            </w:r>
+            <w:r>
+              <w:rPr>
+                <w:sz w:val="22"/>
+              </w:rPr>
+              <w:t xml:space="preserve">предыдущая версия, </w:t>
             </w:r>
             <w:r>
               <w:rPr>
@@ -3060,6 +3127,18 @@
               </w:rPr>
               <w:t>, количество</w:t>
             </w:r>
+            <w:r>
+              <w:rPr>
+                <w:sz w:val="22"/>
+              </w:rPr>
+              <w:t xml:space="preserve">, </w:t>
+            </w:r>
+            <w:r>
+              <w:rPr>
+                <w:sz w:val="22"/>
+              </w:rPr>
+              <w:t>категория комплектующей</w:t>
+            </w:r>
           </w:p>
         </w:tc>
       </w:tr>
@@ -3196,13 +3275,25 @@
               <w:rPr>
                 <w:sz w:val="22"/>
               </w:rPr>
-              <w:t>экземпляр товара</w:t>
+              <w:t xml:space="preserve">экземпляр </w:t>
+            </w:r>
+            <w:r>
+              <w:rPr>
+                <w:sz w:val="22"/>
+              </w:rPr>
+              <w:t>комплектующей</w:t>
             </w:r>
             <w:r>
               <w:rPr>
                 <w:sz w:val="22"/>
               </w:rPr>
               <w:t xml:space="preserve">, </w:t>
+            </w:r>
+            <w:r>
+              <w:rPr>
+                <w:sz w:val="22"/>
+              </w:rPr>
+              <w:t xml:space="preserve">компонент конфигурации сборки, </w:t>
             </w:r>
             <w:r>
               <w:rPr>
@@ -3370,6 +3461,12 @@
               <w:rPr>
                 <w:sz w:val="22"/>
               </w:rPr>
+              <w:t>установленные комплектующие,</w:t>
+            </w:r>
+            <w:r>
+              <w:rPr>
+                <w:sz w:val="22"/>
+              </w:rPr>
               <w:t xml:space="preserve"> дата и время </w:t>
             </w:r>
             <w:r>
@@ -3511,25 +3608,7 @@
               <w:rPr>
                 <w:sz w:val="22"/>
               </w:rPr>
-              <w:t>название,</w:t>
-            </w:r>
-            <w:r>
-              <w:rPr>
-                <w:sz w:val="22"/>
-              </w:rPr>
-              <w:t xml:space="preserve"> </w:t>
-            </w:r>
-            <w:r>
-              <w:rPr>
-                <w:sz w:val="22"/>
-              </w:rPr>
-              <w:t>обязательность, статус</w:t>
-            </w:r>
-            <w:r>
-              <w:rPr>
-                <w:sz w:val="22"/>
-              </w:rPr>
-              <w:t xml:space="preserve"> </w:t>
+              <w:t>сборку, список результатов тестов, дату и время, статус, ответственный, комментарий</w:t>
             </w:r>
           </w:p>
         </w:tc>
@@ -3641,25 +3720,7 @@
               <w:rPr>
                 <w:sz w:val="22"/>
               </w:rPr>
-              <w:t>сборку</w:t>
-            </w:r>
-            <w:r>
-              <w:rPr>
-                <w:sz w:val="22"/>
-              </w:rPr>
-              <w:t>,</w:t>
-            </w:r>
-            <w:r>
-              <w:rPr>
-                <w:sz w:val="22"/>
-              </w:rPr>
-              <w:t xml:space="preserve"> тест сборки,</w:t>
-            </w:r>
-            <w:r>
-              <w:rPr>
-                <w:sz w:val="22"/>
-              </w:rPr>
-              <w:t xml:space="preserve"> дата и время, результат, статус, ответственный, комментарий </w:t>
+              <w:t>название, тест, статус</w:t>
             </w:r>
           </w:p>
         </w:tc>
@@ -3936,6 +3997,12 @@
               <w:rPr>
                 <w:sz w:val="22"/>
               </w:rPr>
+              <w:t xml:space="preserve"> продажа, сборка, экземпляр,</w:t>
+            </w:r>
+            <w:r>
+              <w:rPr>
+                <w:sz w:val="22"/>
+              </w:rPr>
               <w:t xml:space="preserve"> причина обращения</w:t>
             </w:r>
             <w:r>
@@ -3963,134 +4030,28 @@
           </w:p>
         </w:tc>
       </w:tr>
-      <w:tr>
-        <w:tblPrEx>
-          <w:tblCellMar>
-            <w:top w:w="120" w:type="dxa"/>
-            <w:right w:w="8" w:type="dxa"/>
-          </w:tblCellMar>
-        </w:tblPrEx>
-        <w:trPr>
-          <w:trHeight w:val="900"/>
-        </w:trPr>
-        <w:tc>
-          <w:tcPr>
-            <w:tcW w:w="860" w:type="dxa"/>
-            <w:tcBorders>
-              <w:top w:val="single" w:sz="8" w:space="0" w:color="000000"/>
-              <w:left w:val="single" w:sz="8" w:space="0" w:color="000000"/>
-              <w:bottom w:val="single" w:sz="8" w:space="0" w:color="000000"/>
-              <w:right w:val="single" w:sz="8" w:space="0" w:color="000000"/>
-            </w:tcBorders>
-          </w:tcPr>
-          <w:p>
-            <w:pPr>
-              <w:spacing w:after="0" w:line="259" w:lineRule="auto"/>
-              <w:ind w:right="55" w:firstLine="0"/>
-              <w:jc w:val="center"/>
-              <w:rPr>
-                <w:sz w:val="22"/>
-              </w:rPr>
-            </w:pPr>
-          </w:p>
-        </w:tc>
-        <w:tc>
-          <w:tcPr>
-            <w:tcW w:w="1760" w:type="dxa"/>
-            <w:tcBorders>
-              <w:top w:val="single" w:sz="8" w:space="0" w:color="000000"/>
-              <w:left w:val="single" w:sz="8" w:space="0" w:color="000000"/>
-              <w:bottom w:val="single" w:sz="8" w:space="0" w:color="000000"/>
-              <w:right w:val="single" w:sz="8" w:space="0" w:color="000000"/>
-            </w:tcBorders>
-          </w:tcPr>
-          <w:p>
-            <w:pPr>
-              <w:spacing w:after="0" w:line="259" w:lineRule="auto"/>
-              <w:ind w:right="0" w:firstLine="0"/>
-              <w:jc w:val="left"/>
-              <w:rPr>
-                <w:sz w:val="22"/>
-              </w:rPr>
-            </w:pPr>
-          </w:p>
-        </w:tc>
-        <w:tc>
-          <w:tcPr>
-            <w:tcW w:w="3980" w:type="dxa"/>
-            <w:tcBorders>
-              <w:top w:val="single" w:sz="8" w:space="0" w:color="000000"/>
-              <w:left w:val="single" w:sz="8" w:space="0" w:color="000000"/>
-              <w:bottom w:val="single" w:sz="8" w:space="0" w:color="000000"/>
-              <w:right w:val="single" w:sz="8" w:space="0" w:color="000000"/>
-            </w:tcBorders>
-          </w:tcPr>
-          <w:p>
-            <w:pPr>
-              <w:spacing w:after="0" w:line="259" w:lineRule="auto"/>
-              <w:ind w:left="10" w:right="56" w:firstLine="0"/>
-              <w:rPr>
-                <w:sz w:val="22"/>
-              </w:rPr>
-            </w:pPr>
-          </w:p>
-        </w:tc>
-        <w:tc>
-          <w:tcPr>
-            <w:tcW w:w="4460" w:type="dxa"/>
-            <w:tcBorders>
-              <w:top w:val="single" w:sz="8" w:space="0" w:color="000000"/>
-              <w:left w:val="single" w:sz="8" w:space="0" w:color="000000"/>
-              <w:bottom w:val="single" w:sz="8" w:space="0" w:color="000000"/>
-              <w:right w:val="single" w:sz="8" w:space="0" w:color="000000"/>
-            </w:tcBorders>
-          </w:tcPr>
-          <w:p>
-            <w:pPr>
-              <w:spacing w:after="0"/>
-              <w:ind w:left="5" w:right="0" w:firstLine="0"/>
-              <w:rPr>
-                <w:sz w:val="22"/>
-              </w:rPr>
-            </w:pPr>
-          </w:p>
-        </w:tc>
-      </w:tr>
     </w:tbl>
-    <w:p>
-      <w:pPr>
-        <w:spacing w:after="0" w:line="259" w:lineRule="auto"/>
-        <w:ind w:right="0" w:firstLine="0"/>
-        <w:jc w:val="left"/>
-      </w:pPr>
-    </w:p>
     <w:p>
       <w:pPr>
         <w:spacing w:after="95" w:line="259" w:lineRule="auto"/>
         <w:ind w:left="405" w:right="0" w:firstLine="0"/>
         <w:jc w:val="left"/>
       </w:pPr>
+    </w:p>
+    <w:p>
+      <w:pPr>
+        <w:spacing w:after="0" w:line="259" w:lineRule="auto"/>
+        <w:ind w:right="0" w:firstLine="0"/>
+        <w:jc w:val="left"/>
+        <w:rPr>
+          <w:b/>
+          <w:sz w:val="28"/>
+        </w:rPr>
+      </w:pPr>
       <w:r>
         <w:rPr>
           <w:sz w:val="22"/>
         </w:rPr>
-        <w:t xml:space="preserve"> </w:t>
-      </w:r>
-    </w:p>
-    <w:p>
-      <w:pPr>
-        <w:spacing w:after="0" w:line="259" w:lineRule="auto"/>
-        <w:ind w:right="0" w:firstLine="0"/>
-        <w:jc w:val="left"/>
-        <w:rPr>
-          <w:b/>
-          <w:sz w:val="28"/>
-        </w:rPr>
-      </w:pPr>
-      <w:r>
-        <w:rPr>
-          <w:sz w:val="22"/>
-        </w:rPr>
         <w:t xml:space="preserve">  </w:t>
       </w:r>
       <w:r>
@@ -4107,6 +4068,292 @@
         </w:rPr>
         <w:t xml:space="preserve"> матрица связей сущностей с указанием кратности.</w:t>
       </w:r>
+    </w:p>
+    <w:p>
+      <w:pPr>
+        <w:spacing w:after="0" w:line="259" w:lineRule="auto"/>
+        <w:ind w:right="0" w:firstLine="0"/>
+        <w:jc w:val="left"/>
+        <w:rPr>
+          <w:b/>
+          <w:sz w:val="28"/>
+        </w:rPr>
+      </w:pPr>
+    </w:p>
+    <w:p>
+      <w:pPr>
+        <w:spacing w:after="0" w:line="259" w:lineRule="auto"/>
+        <w:ind w:right="0" w:firstLine="0"/>
+        <w:jc w:val="left"/>
+        <w:rPr>
+          <w:b/>
+          <w:sz w:val="28"/>
+        </w:rPr>
+      </w:pPr>
+    </w:p>
+    <w:p>
+      <w:pPr>
+        <w:spacing w:after="0" w:line="259" w:lineRule="auto"/>
+        <w:ind w:right="0" w:firstLine="0"/>
+        <w:jc w:val="left"/>
+        <w:rPr>
+          <w:b/>
+          <w:sz w:val="28"/>
+        </w:rPr>
+      </w:pPr>
+    </w:p>
+    <w:p>
+      <w:pPr>
+        <w:spacing w:after="0" w:line="259" w:lineRule="auto"/>
+        <w:ind w:right="0" w:firstLine="0"/>
+        <w:jc w:val="left"/>
+        <w:rPr>
+          <w:b/>
+          <w:sz w:val="28"/>
+        </w:rPr>
+      </w:pPr>
+    </w:p>
+    <w:p>
+      <w:pPr>
+        <w:spacing w:after="0" w:line="259" w:lineRule="auto"/>
+        <w:ind w:right="0" w:firstLine="0"/>
+        <w:jc w:val="left"/>
+        <w:rPr>
+          <w:b/>
+          <w:sz w:val="28"/>
+        </w:rPr>
+      </w:pPr>
+    </w:p>
+    <w:p>
+      <w:pPr>
+        <w:spacing w:after="0" w:line="259" w:lineRule="auto"/>
+        <w:ind w:right="0" w:firstLine="0"/>
+        <w:jc w:val="left"/>
+        <w:rPr>
+          <w:b/>
+          <w:sz w:val="28"/>
+        </w:rPr>
+      </w:pPr>
+    </w:p>
+    <w:p>
+      <w:pPr>
+        <w:spacing w:after="0" w:line="259" w:lineRule="auto"/>
+        <w:ind w:right="0" w:firstLine="0"/>
+        <w:jc w:val="left"/>
+        <w:rPr>
+          <w:b/>
+          <w:sz w:val="28"/>
+        </w:rPr>
+      </w:pPr>
+    </w:p>
+    <w:p>
+      <w:pPr>
+        <w:spacing w:after="0" w:line="259" w:lineRule="auto"/>
+        <w:ind w:right="0" w:firstLine="0"/>
+        <w:jc w:val="left"/>
+        <w:rPr>
+          <w:b/>
+          <w:sz w:val="28"/>
+        </w:rPr>
+      </w:pPr>
+    </w:p>
+    <w:p>
+      <w:pPr>
+        <w:spacing w:after="0" w:line="259" w:lineRule="auto"/>
+        <w:ind w:right="0" w:firstLine="0"/>
+        <w:jc w:val="left"/>
+        <w:rPr>
+          <w:b/>
+          <w:sz w:val="28"/>
+        </w:rPr>
+      </w:pPr>
+    </w:p>
+    <w:p>
+      <w:pPr>
+        <w:spacing w:after="0" w:line="259" w:lineRule="auto"/>
+        <w:ind w:right="0" w:firstLine="0"/>
+        <w:jc w:val="left"/>
+        <w:rPr>
+          <w:b/>
+          <w:sz w:val="28"/>
+        </w:rPr>
+      </w:pPr>
+    </w:p>
+    <w:p>
+      <w:pPr>
+        <w:spacing w:after="0" w:line="259" w:lineRule="auto"/>
+        <w:ind w:right="0" w:firstLine="0"/>
+        <w:jc w:val="left"/>
+        <w:rPr>
+          <w:b/>
+          <w:sz w:val="28"/>
+        </w:rPr>
+      </w:pPr>
+    </w:p>
+    <w:p>
+      <w:pPr>
+        <w:spacing w:after="0" w:line="259" w:lineRule="auto"/>
+        <w:ind w:right="0" w:firstLine="0"/>
+        <w:jc w:val="left"/>
+        <w:rPr>
+          <w:b/>
+          <w:sz w:val="28"/>
+        </w:rPr>
+      </w:pPr>
+    </w:p>
+    <w:p>
+      <w:pPr>
+        <w:spacing w:after="0" w:line="259" w:lineRule="auto"/>
+        <w:ind w:right="0" w:firstLine="0"/>
+        <w:jc w:val="left"/>
+        <w:rPr>
+          <w:b/>
+          <w:sz w:val="28"/>
+        </w:rPr>
+      </w:pPr>
+    </w:p>
+    <w:p>
+      <w:pPr>
+        <w:spacing w:after="0" w:line="259" w:lineRule="auto"/>
+        <w:ind w:right="0" w:firstLine="0"/>
+        <w:jc w:val="left"/>
+        <w:rPr>
+          <w:b/>
+          <w:sz w:val="28"/>
+        </w:rPr>
+      </w:pPr>
+    </w:p>
+    <w:p>
+      <w:pPr>
+        <w:spacing w:after="0" w:line="259" w:lineRule="auto"/>
+        <w:ind w:right="0" w:firstLine="0"/>
+        <w:jc w:val="left"/>
+        <w:rPr>
+          <w:b/>
+          <w:sz w:val="28"/>
+        </w:rPr>
+      </w:pPr>
+    </w:p>
+    <w:p>
+      <w:pPr>
+        <w:spacing w:after="0" w:line="259" w:lineRule="auto"/>
+        <w:ind w:right="0" w:firstLine="0"/>
+        <w:jc w:val="left"/>
+        <w:rPr>
+          <w:b/>
+          <w:sz w:val="28"/>
+        </w:rPr>
+      </w:pPr>
+    </w:p>
+    <w:p>
+      <w:pPr>
+        <w:spacing w:after="0" w:line="259" w:lineRule="auto"/>
+        <w:ind w:right="0" w:firstLine="0"/>
+        <w:jc w:val="left"/>
+        <w:rPr>
+          <w:b/>
+          <w:sz w:val="28"/>
+        </w:rPr>
+      </w:pPr>
+    </w:p>
+    <w:p>
+      <w:pPr>
+        <w:spacing w:after="0" w:line="259" w:lineRule="auto"/>
+        <w:ind w:right="0" w:firstLine="0"/>
+        <w:jc w:val="left"/>
+        <w:rPr>
+          <w:b/>
+          <w:sz w:val="28"/>
+        </w:rPr>
+      </w:pPr>
+    </w:p>
+    <w:p>
+      <w:pPr>
+        <w:spacing w:after="0" w:line="259" w:lineRule="auto"/>
+        <w:ind w:right="0" w:firstLine="0"/>
+        <w:jc w:val="left"/>
+        <w:rPr>
+          <w:b/>
+          <w:sz w:val="28"/>
+        </w:rPr>
+      </w:pPr>
+    </w:p>
+    <w:p>
+      <w:pPr>
+        <w:spacing w:after="0" w:line="259" w:lineRule="auto"/>
+        <w:ind w:right="0" w:firstLine="0"/>
+        <w:jc w:val="left"/>
+        <w:rPr>
+          <w:b/>
+          <w:sz w:val="28"/>
+        </w:rPr>
+      </w:pPr>
+    </w:p>
+    <w:p>
+      <w:pPr>
+        <w:spacing w:after="0" w:line="259" w:lineRule="auto"/>
+        <w:ind w:right="0" w:firstLine="0"/>
+        <w:jc w:val="left"/>
+        <w:rPr>
+          <w:b/>
+          <w:sz w:val="28"/>
+        </w:rPr>
+      </w:pPr>
+    </w:p>
+    <w:p>
+      <w:pPr>
+        <w:spacing w:after="0" w:line="259" w:lineRule="auto"/>
+        <w:ind w:right="0" w:firstLine="0"/>
+        <w:jc w:val="left"/>
+        <w:rPr>
+          <w:b/>
+          <w:sz w:val="28"/>
+        </w:rPr>
+      </w:pPr>
+    </w:p>
+    <w:p>
+      <w:pPr>
+        <w:spacing w:after="0" w:line="259" w:lineRule="auto"/>
+        <w:ind w:right="0" w:firstLine="0"/>
+        <w:jc w:val="left"/>
+        <w:rPr>
+          <w:b/>
+          <w:sz w:val="28"/>
+        </w:rPr>
+      </w:pPr>
+    </w:p>
+    <w:p>
+      <w:pPr>
+        <w:spacing w:after="0" w:line="259" w:lineRule="auto"/>
+        <w:ind w:right="0" w:firstLine="0"/>
+        <w:jc w:val="left"/>
+        <w:rPr>
+          <w:b/>
+          <w:sz w:val="28"/>
+        </w:rPr>
+      </w:pPr>
+    </w:p>
+    <w:p>
+      <w:pPr>
+        <w:spacing w:after="0" w:line="259" w:lineRule="auto"/>
+        <w:ind w:right="0" w:firstLine="0"/>
+        <w:jc w:val="left"/>
+        <w:rPr>
+          <w:b/>
+          <w:sz w:val="28"/>
+        </w:rPr>
+      </w:pPr>
+    </w:p>
+    <w:p>
+      <w:pPr>
+        <w:spacing w:after="0" w:line="259" w:lineRule="auto"/>
+        <w:ind w:right="0" w:firstLine="0"/>
+        <w:jc w:val="left"/>
+        <w:rPr>
+          <w:b/>
+          <w:sz w:val="28"/>
+        </w:rPr>
+      </w:pPr>
     </w:p>
     <w:p>
       <w:pPr>
@@ -4137,12 +4384,11 @@
           <w:color w:val="C00000"/>
           <w:sz w:val="28"/>
         </w:rPr>
-        <w:lastRenderedPageBreak/>
         <w:drawing>
-          <wp:inline distT="0" distB="0" distL="0" distR="0" wp14:anchorId="2CE8F14D" wp14:editId="62B7364E">
-            <wp:extent cx="7052310" cy="7037070"/>
-            <wp:effectExtent l="0" t="0" r="0" b="0"/>
-            <wp:docPr id="1324520224" name="Рисунок 1"/>
+          <wp:inline distT="0" distB="0" distL="0" distR="0" wp14:anchorId="523B07EC" wp14:editId="0EC41F68">
+            <wp:extent cx="7197212" cy="6773091"/>
+            <wp:effectExtent l="0" t="0" r="3810" b="8890"/>
+            <wp:docPr id="622331590" name="Рисунок 1"/>
             <wp:cNvGraphicFramePr>
               <a:graphicFrameLocks xmlns:a="http://schemas.openxmlformats.org/drawingml/2006/main" noChangeAspect="1"/>
             </wp:cNvGraphicFramePr>
@@ -4150,7 +4396,7 @@
               <a:graphicData uri="http://schemas.openxmlformats.org/drawingml/2006/picture">
                 <pic:pic xmlns:pic="http://schemas.openxmlformats.org/drawingml/2006/picture">
                   <pic:nvPicPr>
-                    <pic:cNvPr id="1324520224" name=""/>
+                    <pic:cNvPr id="622331590" name=""/>
                     <pic:cNvPicPr/>
                   </pic:nvPicPr>
                   <pic:blipFill>
@@ -4162,7 +4408,7 @@
                   <pic:spPr>
                     <a:xfrm>
                       <a:off x="0" y="0"/>
-                      <a:ext cx="7052310" cy="7037070"/>
+                      <a:ext cx="7207230" cy="6782518"/>
                     </a:xfrm>
                     <a:prstGeom prst="rect">
                       <a:avLst/>
@@ -4174,270 +4420,6 @@
           </wp:inline>
         </w:drawing>
       </w:r>
-    </w:p>
-    <w:p>
-      <w:pPr>
-        <w:spacing w:after="0" w:line="259" w:lineRule="auto"/>
-        <w:ind w:right="0" w:firstLine="0"/>
-        <w:jc w:val="left"/>
-        <w:rPr>
-          <w:b/>
-          <w:color w:val="C00000"/>
-          <w:sz w:val="28"/>
-        </w:rPr>
-      </w:pPr>
-    </w:p>
-    <w:p>
-      <w:pPr>
-        <w:spacing w:after="0" w:line="259" w:lineRule="auto"/>
-        <w:ind w:right="0" w:firstLine="0"/>
-        <w:jc w:val="left"/>
-        <w:rPr>
-          <w:b/>
-          <w:color w:val="C00000"/>
-          <w:sz w:val="28"/>
-        </w:rPr>
-      </w:pPr>
-    </w:p>
-    <w:p>
-      <w:pPr>
-        <w:spacing w:after="0" w:line="259" w:lineRule="auto"/>
-        <w:ind w:right="0" w:firstLine="0"/>
-        <w:jc w:val="left"/>
-        <w:rPr>
-          <w:b/>
-          <w:color w:val="C00000"/>
-          <w:sz w:val="28"/>
-        </w:rPr>
-      </w:pPr>
-      <w:r>
-        <w:rPr>
-          <w:b/>
-          <w:color w:val="C00000"/>
-          <w:sz w:val="28"/>
-        </w:rPr>
-        <w:t>ДОЛЖНО БЫТЬ ЗЕРКАЛЬНЫМ</w:t>
-      </w:r>
-      <w:r>
-        <w:rPr>
-          <w:b/>
-          <w:color w:val="C00000"/>
-          <w:sz w:val="28"/>
-        </w:rPr>
-        <w:t xml:space="preserve"> ОТНОСИТЕЛЬНО ГЛАВНОЙ ДИАГОНАЛИ</w:t>
-      </w:r>
-    </w:p>
-    <w:p>
-      <w:pPr>
-        <w:spacing w:after="0" w:line="259" w:lineRule="auto"/>
-        <w:ind w:right="0" w:firstLine="0"/>
-        <w:jc w:val="left"/>
-        <w:rPr>
-          <w:b/>
-          <w:color w:val="C00000"/>
-          <w:sz w:val="28"/>
-        </w:rPr>
-      </w:pPr>
-    </w:p>
-    <w:p>
-      <w:pPr>
-        <w:spacing w:after="0" w:line="259" w:lineRule="auto"/>
-        <w:ind w:right="0" w:firstLine="0"/>
-        <w:jc w:val="left"/>
-        <w:rPr>
-          <w:b/>
-          <w:color w:val="C00000"/>
-          <w:sz w:val="28"/>
-          <w:lang w:val="en-US"/>
-        </w:rPr>
-      </w:pPr>
-      <w:r>
-        <w:rPr>
-          <w:b/>
-          <w:color w:val="C00000"/>
-          <w:sz w:val="28"/>
-          <w:lang w:val="en-US"/>
-        </w:rPr>
-        <w:t xml:space="preserve">E1 E8 MJUST BE </w:t>
-      </w:r>
-      <w:r>
-        <w:rPr>
-          <w:b/>
-          <w:color w:val="C00000"/>
-          <w:sz w:val="28"/>
-          <w:lang w:val="en-US"/>
-        </w:rPr>
-        <w:t>N:N</w:t>
-      </w:r>
-    </w:p>
-    <w:p>
-      <w:pPr>
-        <w:spacing w:after="0" w:line="259" w:lineRule="auto"/>
-        <w:ind w:right="0" w:firstLine="0"/>
-        <w:jc w:val="left"/>
-        <w:rPr>
-          <w:b/>
-          <w:color w:val="C00000"/>
-          <w:sz w:val="28"/>
-          <w:lang w:val="en-US"/>
-        </w:rPr>
-      </w:pPr>
-      <w:r>
-        <w:rPr>
-          <w:b/>
-          <w:color w:val="C00000"/>
-          <w:sz w:val="28"/>
-          <w:lang w:val="en-US"/>
-        </w:rPr>
-        <w:t>E8 E1 delete transition</w:t>
-      </w:r>
-    </w:p>
-    <w:p>
-      <w:pPr>
-        <w:spacing w:after="0" w:line="259" w:lineRule="auto"/>
-        <w:ind w:right="0" w:firstLine="0"/>
-        <w:jc w:val="left"/>
-        <w:rPr>
-          <w:b/>
-          <w:color w:val="C00000"/>
-          <w:sz w:val="28"/>
-          <w:lang w:val="en-US"/>
-        </w:rPr>
-      </w:pPr>
-      <w:r>
-        <w:rPr>
-          <w:b/>
-          <w:color w:val="C00000"/>
-          <w:sz w:val="28"/>
-          <w:lang w:val="en-US"/>
-        </w:rPr>
-        <w:t>E10 E11 must be n:1</w:t>
-      </w:r>
-    </w:p>
-    <w:p>
-      <w:pPr>
-        <w:spacing w:after="0" w:line="259" w:lineRule="auto"/>
-        <w:ind w:right="0" w:firstLine="0"/>
-        <w:jc w:val="left"/>
-        <w:rPr>
-          <w:b/>
-          <w:color w:val="C00000"/>
-          <w:sz w:val="28"/>
-        </w:rPr>
-      </w:pPr>
-      <w:r>
-        <w:rPr>
-          <w:b/>
-          <w:color w:val="C00000"/>
-          <w:sz w:val="28"/>
-          <w:lang w:val="en-US"/>
-        </w:rPr>
-        <w:t>E18 e9 must be 1:N</w:t>
-      </w:r>
-    </w:p>
-    <w:p>
-      <w:pPr>
-        <w:spacing w:after="0" w:line="259" w:lineRule="auto"/>
-        <w:ind w:right="0" w:firstLine="0"/>
-        <w:jc w:val="left"/>
-        <w:rPr>
-          <w:b/>
-          <w:color w:val="C00000"/>
-          <w:sz w:val="28"/>
-          <w:lang w:val="en-US"/>
-        </w:rPr>
-      </w:pPr>
-      <w:r>
-        <w:rPr>
-          <w:b/>
-          <w:color w:val="C00000"/>
-          <w:sz w:val="28"/>
-          <w:lang w:val="en-US"/>
-        </w:rPr>
-        <w:t>E17 e14 must be 1:N</w:t>
-      </w:r>
-    </w:p>
-    <w:p>
-      <w:pPr>
-        <w:spacing w:after="0" w:line="259" w:lineRule="auto"/>
-        <w:ind w:right="0" w:firstLine="0"/>
-        <w:jc w:val="left"/>
-        <w:rPr>
-          <w:b/>
-          <w:color w:val="C00000"/>
-          <w:sz w:val="28"/>
-        </w:rPr>
-      </w:pPr>
-      <w:r>
-        <w:rPr>
-          <w:b/>
-          <w:color w:val="C00000"/>
-          <w:sz w:val="28"/>
-          <w:lang w:val="en-US"/>
-        </w:rPr>
-        <w:t>E</w:t>
-      </w:r>
-      <w:r>
-        <w:rPr>
-          <w:b/>
-          <w:color w:val="C00000"/>
-          <w:sz w:val="28"/>
-        </w:rPr>
-        <w:t xml:space="preserve">18 </w:t>
-      </w:r>
-      <w:r>
-        <w:rPr>
-          <w:b/>
-          <w:color w:val="C00000"/>
-          <w:sz w:val="28"/>
-          <w:lang w:val="en-US"/>
-        </w:rPr>
-        <w:t>E17 must be 1:N</w:t>
-      </w:r>
-    </w:p>
-    <w:p>
-      <w:pPr>
-        <w:spacing w:after="0" w:line="259" w:lineRule="auto"/>
-        <w:ind w:right="0" w:firstLine="0"/>
-        <w:jc w:val="left"/>
-        <w:rPr>
-          <w:b/>
-          <w:color w:val="C00000"/>
-          <w:sz w:val="28"/>
-        </w:rPr>
-      </w:pPr>
-      <w:r>
-        <w:rPr>
-          <w:b/>
-          <w:color w:val="C00000"/>
-          <w:sz w:val="28"/>
-        </w:rPr>
-        <w:t>Переделать е15 как интерфейс над множеством результатов отдельных тестов е16</w:t>
-      </w:r>
-    </w:p>
-    <w:p>
-      <w:pPr>
-        <w:spacing w:after="0" w:line="259" w:lineRule="auto"/>
-        <w:ind w:right="0" w:firstLine="0"/>
-        <w:jc w:val="left"/>
-        <w:rPr>
-          <w:b/>
-          <w:color w:val="C00000"/>
-          <w:sz w:val="28"/>
-        </w:rPr>
-      </w:pPr>
-    </w:p>
-    <w:p>
-      <w:pPr>
-        <w:spacing w:after="0" w:line="259" w:lineRule="auto"/>
-        <w:ind w:right="0" w:firstLine="0"/>
-        <w:jc w:val="left"/>
-        <w:rPr>
-          <w:b/>
-          <w:color w:val="C00000"/>
-          <w:sz w:val="28"/>
-        </w:rPr>
-      </w:pPr>
     </w:p>
     <w:sectPr>
       <w:pgSz w:w="12240" w:h="15840"/>

</xml_diff>